<commit_message>
docs(cifie): apply Option A clean academic header to response letter
</commit_message>
<xml_diff>
--- a/publications/book_chapters/2026_cifie_xai_fom7/drafts/v5_revision_1/RESPUESTA_A_REVISORES_REVISION_1.docx
+++ b/publications/book_chapters/2026_cifie_xai_fom7/drafts/v5_revision_1/RESPUESTA_A_REVISORES_REVISION_1.docx
@@ -2,11 +2,11 @@
 <file path=word/document.xml><?xml version="1.0" encoding="utf-8"?>
 <w:document xmlns:w="http://schemas.openxmlformats.org/wordprocessingml/2006/main" xmlns:m="http://schemas.openxmlformats.org/officeDocument/2006/math" xmlns:r="http://schemas.openxmlformats.org/officeDocument/2006/relationships" xmlns:o="urn:schemas-microsoft-com:office:office" xmlns:v="urn:schemas-microsoft-com:vml" xmlns:w10="urn:schemas-microsoft-com:office:word" xmlns:a="http://schemas.openxmlformats.org/drawingml/2006/main" xmlns:pic="http://schemas.openxmlformats.org/drawingml/2006/picture" xmlns:wp="http://schemas.openxmlformats.org/drawingml/2006/wordprocessingDrawing">
   <w:body>
-    <w:bookmarkStart w:id="20" w:name="X16e50e5c74a01e10cfd5e00d82e8d7cae092ce0"/>
+    <w:bookmarkStart w:id="18" w:name="X16e50e5c74a01e10cfd5e00d82e8d7cae092ce0"/>
     <w:p>
       <w:pPr>
         <w:pStyle w:val="Heading1"/>
-        <w:spacing w:before="240" w:after="120"/>
+        <w:spacing w:before="280" w:after="160"/>
         <w:jc w:val="left"/>
       </w:pPr>
       <w:r>
@@ -20,34 +20,18 @@
     <w:p>
       <w:pPr>
         <w:pStyle w:val="FirstParagraph"/>
-        <w:spacing w:line="312" w:lineRule="auto" w:after="80"/>
-        <w:jc w:val="both"/>
-      </w:pPr>
-      <w:r>
-        <w:rPr>
-          <w:rFonts w:ascii="Times New Roman" w:hAnsi="Times New Roman"/>
-          <w:b/>
-          <w:bCs/>
-          <w:color w:val="000000"/>
-          <w:sz w:val="23"/>
-        </w:rPr>
-        <w:t xml:space="preserve">Obra:</w:t>
-      </w:r>
-      <w:r>
-        <w:rPr>
-          <w:rFonts w:ascii="Times New Roman" w:hAnsi="Times New Roman"/>
-          <w:color w:val="000000"/>
-          <w:sz w:val="23"/>
-        </w:rPr>
-        <w:t xml:space="preserve"> </w:t>
-      </w:r>
-      <w:r>
-        <w:rPr>
-          <w:rFonts w:ascii="Times New Roman" w:hAnsi="Times New Roman"/>
-          <w:color w:val="000000"/>
-          <w:sz w:val="23"/>
-        </w:rPr>
-        <w:t xml:space="preserve">Capítulo de Libro:</w:t>
+        <w:spacing w:line="276" w:lineRule="auto" w:before="40" w:after="60"/>
+        <w:jc w:val="left"/>
+      </w:pPr>
+      <w:r>
+        <w:rPr>
+          <w:rFonts w:ascii="Times New Roman" w:hAnsi="Times New Roman"/>
+          <w:b/>
+          <w:bCs/>
+          <w:color w:val="000000"/>
+          <w:sz w:val="23"/>
+        </w:rPr>
+        <w:t xml:space="preserve">Capítulo:</w:t>
       </w:r>
       <w:r>
         <w:rPr>
@@ -65,7 +49,7 @@
           <w:color w:val="000000"/>
           <w:sz w:val="23"/>
         </w:rPr>
-        <w:t xml:space="preserve">Protocolo FOM-7 para la Evaluación y Auditoría de Explicaciones Post-hoc en Aprendizaje Automático</w:t>
+        <w:t xml:space="preserve">De la explicación a la evidencia: fundamentos, aplicaciones y evaluación auditable de la inteligencia artificial explicable</w:t>
       </w:r>
       <w:r>
         <w:rPr>
@@ -83,23 +67,23 @@
           <w:color w:val="000000"/>
           <w:sz w:val="23"/>
         </w:rPr>
-        <w:t xml:space="preserve">Colección / Editorial:</w:t>
-      </w:r>
-      <w:r>
-        <w:rPr>
-          <w:rFonts w:ascii="Times New Roman" w:hAnsi="Times New Roman"/>
-          <w:color w:val="000000"/>
-          <w:sz w:val="23"/>
-        </w:rPr>
-        <w:t xml:space="preserve"> </w:t>
-      </w:r>
-      <w:r>
-        <w:rPr>
-          <w:rFonts w:ascii="Times New Roman" w:hAnsi="Times New Roman"/>
-          <w:color w:val="000000"/>
-          <w:sz w:val="23"/>
-        </w:rPr>
-        <w:t xml:space="preserve">CIFIE / Editorial Tintazul (2026)</w:t>
+        <w:t xml:space="preserve">Autor:</w:t>
+      </w:r>
+      <w:r>
+        <w:rPr>
+          <w:rFonts w:ascii="Times New Roman" w:hAnsi="Times New Roman"/>
+          <w:color w:val="000000"/>
+          <w:sz w:val="23"/>
+        </w:rPr>
+        <w:t xml:space="preserve"> </w:t>
+      </w:r>
+      <w:r>
+        <w:rPr>
+          <w:rFonts w:ascii="Times New Roman" w:hAnsi="Times New Roman"/>
+          <w:color w:val="000000"/>
+          <w:sz w:val="23"/>
+        </w:rPr>
+        <w:t xml:space="preserve">Jonathan Herrera-Vásquez (Universidad Americana de Europa)</w:t>
       </w:r>
       <w:r>
         <w:rPr>
@@ -133,7 +117,7 @@
           <w:color w:val="000000"/>
           <w:sz w:val="23"/>
         </w:rPr>
-        <w:t xml:space="preserve">Dra. Irene Arostegui</w:t>
+        <w:t xml:space="preserve">Dra. Irene Arostegui (Colección CIFIE / Editorial Tintazul)</w:t>
       </w:r>
       <w:r>
         <w:rPr>
@@ -151,41 +135,7 @@
           <w:color w:val="000000"/>
           <w:sz w:val="23"/>
         </w:rPr>
-        <w:t xml:space="preserve">Autor:</w:t>
-      </w:r>
-      <w:r>
-        <w:rPr>
-          <w:rFonts w:ascii="Times New Roman" w:hAnsi="Times New Roman"/>
-          <w:color w:val="000000"/>
-          <w:sz w:val="23"/>
-        </w:rPr>
-        <w:t xml:space="preserve"> </w:t>
-      </w:r>
-      <w:r>
-        <w:rPr>
-          <w:rFonts w:ascii="Times New Roman" w:hAnsi="Times New Roman"/>
-          <w:color w:val="000000"/>
-          <w:sz w:val="23"/>
-        </w:rPr>
-        <w:t xml:space="preserve">Jonathan Herrera-Vásquez</w:t>
-      </w:r>
-      <w:r>
-        <w:rPr>
-          <w:rFonts w:ascii="Times New Roman" w:hAnsi="Times New Roman"/>
-          <w:color w:val="000000"/>
-          <w:sz w:val="23"/>
-        </w:rPr>
-        <w:br/>
-      </w:r>
-      <w:r>
-        <w:rPr>
-          <w:rFonts w:ascii="Times New Roman" w:hAnsi="Times New Roman"/>
-          <w:b/>
-          <w:bCs/>
-          <w:color w:val="000000"/>
-          <w:sz w:val="23"/>
-        </w:rPr>
-        <w:t xml:space="preserve">Fecha de Respuesta:</w:t>
+        <w:t xml:space="preserve">Fecha:</w:t>
       </w:r>
       <w:r>
         <w:rPr>
@@ -203,247 +153,10 @@
         </w:rPr>
         <w:t xml:space="preserve">24 de octubre de 2026</w:t>
       </w:r>
-      <w:r>
-        <w:rPr>
-          <w:rFonts w:ascii="Times New Roman" w:hAnsi="Times New Roman"/>
-          <w:color w:val="000000"/>
-          <w:sz w:val="23"/>
-        </w:rPr>
-        <w:br/>
-      </w:r>
-      <w:r>
-        <w:rPr>
-          <w:rFonts w:ascii="Times New Roman" w:hAnsi="Times New Roman"/>
-          <w:b/>
-          <w:bCs/>
-          <w:color w:val="000000"/>
-          <w:sz w:val="23"/>
-        </w:rPr>
-        <w:t xml:space="preserve">Rama de Trabajo:</w:t>
-      </w:r>
-      <w:r>
-        <w:rPr>
-          <w:rFonts w:ascii="Times New Roman" w:hAnsi="Times New Roman"/>
-          <w:color w:val="000000"/>
-          <w:sz w:val="23"/>
-        </w:rPr>
-        <w:t xml:space="preserve"> </w:t>
-      </w:r>
-      <w:r>
-        <w:rPr>
-          <w:rStyle w:val="VerbatimChar"/>
-          <w:rFonts w:ascii="Times New Roman" w:hAnsi="Times New Roman"/>
-          <w:color w:val="000000"/>
-          <w:sz w:val="23"/>
-        </w:rPr>
-        <w:t xml:space="preserve">chapter/cifie-revision-1</w:t>
-      </w:r>
-      <w:r>
-        <w:rPr>
-          <w:rFonts w:ascii="Times New Roman" w:hAnsi="Times New Roman"/>
-          <w:color w:val="000000"/>
-          <w:sz w:val="23"/>
-        </w:rPr>
-        <w:br/>
-      </w:r>
-      <w:r>
-        <w:rPr>
-          <w:rFonts w:ascii="Times New Roman" w:hAnsi="Times New Roman"/>
-          <w:b/>
-          <w:bCs/>
-          <w:color w:val="000000"/>
-          <w:sz w:val="23"/>
-        </w:rPr>
-        <w:t xml:space="preserve">Documentos Modificados:</w:t>
-      </w:r>
-      <w:r>
-        <w:rPr>
-          <w:rFonts w:ascii="Times New Roman" w:hAnsi="Times New Roman"/>
-          <w:color w:val="000000"/>
-          <w:sz w:val="23"/>
-        </w:rPr>
-        <w:t xml:space="preserve"> </w:t>
-      </w:r>
-      <w:r>
-        <w:rPr>
-          <w:rStyle w:val="VerbatimChar"/>
-          <w:rFonts w:ascii="Times New Roman" w:hAnsi="Times New Roman"/>
-          <w:color w:val="000000"/>
-          <w:sz w:val="23"/>
-        </w:rPr>
-        <w:t xml:space="preserve">publications/book_chapters/2026_cifie_xai_fom7/manuscript/</w:t>
-      </w:r>
-      <w:r>
-        <w:rPr>
-          <w:rFonts w:ascii="Times New Roman" w:hAnsi="Times New Roman"/>
-          <w:color w:val="000000"/>
-          <w:sz w:val="23"/>
-        </w:rPr>
-        <w:t xml:space="preserve"> </w:t>
-      </w:r>
-      <w:r>
-        <w:rPr>
-          <w:rFonts w:ascii="Times New Roman" w:hAnsi="Times New Roman"/>
-          <w:color w:val="000000"/>
-          <w:sz w:val="23"/>
-        </w:rPr>
-        <w:t xml:space="preserve">(Secciones 02, 06, 07, 10 y 11) y</w:t>
-      </w:r>
-      <w:r>
-        <w:rPr>
-          <w:rFonts w:ascii="Times New Roman" w:hAnsi="Times New Roman"/>
-          <w:color w:val="000000"/>
-          <w:sz w:val="23"/>
-        </w:rPr>
-        <w:t xml:space="preserve"> </w:t>
-      </w:r>
-      <w:r>
-        <w:rPr>
-          <w:rStyle w:val="VerbatimChar"/>
-          <w:rFonts w:ascii="Times New Roman" w:hAnsi="Times New Roman"/>
-          <w:color w:val="000000"/>
-          <w:sz w:val="23"/>
-        </w:rPr>
-        <w:t xml:space="preserve">tables/</w:t>
-      </w:r>
-      <w:r>
-        <w:rPr>
-          <w:rFonts w:ascii="Times New Roman" w:hAnsi="Times New Roman"/>
-          <w:color w:val="000000"/>
-          <w:sz w:val="23"/>
-        </w:rPr>
-        <w:t xml:space="preserve"> </w:t>
-      </w:r>
-      <w:r>
-        <w:rPr>
-          <w:rFonts w:ascii="Times New Roman" w:hAnsi="Times New Roman"/>
-          <w:color w:val="000000"/>
-          <w:sz w:val="23"/>
-        </w:rPr>
-        <w:t xml:space="preserve">(Tablas 1 y 2).</w:t>
-      </w:r>
-      <w:r>
-        <w:rPr>
-          <w:rFonts w:ascii="Times New Roman" w:hAnsi="Times New Roman"/>
-          <w:color w:val="000000"/>
-          <w:sz w:val="23"/>
-        </w:rPr>
-        <w:br/>
-      </w:r>
-      <w:r>
-        <w:rPr>
-          <w:rFonts w:ascii="Times New Roman" w:hAnsi="Times New Roman"/>
-          <w:b/>
-          <w:bCs/>
-          <w:color w:val="000000"/>
-          <w:sz w:val="23"/>
-        </w:rPr>
-        <w:t xml:space="preserve">Entregables Compilados:</w:t>
-      </w:r>
-      <w:r>
-        <w:rPr>
-          <w:rFonts w:ascii="Times New Roman" w:hAnsi="Times New Roman"/>
-          <w:color w:val="000000"/>
-          <w:sz w:val="23"/>
-        </w:rPr>
-        <w:br/>
-      </w:r>
-      <w:r>
-        <w:rPr>
-          <w:rFonts w:ascii="Times New Roman" w:hAnsi="Times New Roman"/>
-          <w:color w:val="000000"/>
-          <w:sz w:val="23"/>
-        </w:rPr>
-        <w:t xml:space="preserve">-</w:t>
-      </w:r>
-      <w:r>
-        <w:rPr>
-          <w:rFonts w:ascii="Times New Roman" w:hAnsi="Times New Roman"/>
-          <w:color w:val="000000"/>
-          <w:sz w:val="23"/>
-        </w:rPr>
-        <w:t xml:space="preserve"> </w:t>
-      </w:r>
-      <w:r>
-        <w:rPr>
-          <w:rFonts w:ascii="Times New Roman" w:hAnsi="Times New Roman"/>
-          <w:b/>
-          <w:bCs/>
-          <w:color w:val="000000"/>
-          <w:sz w:val="23"/>
-        </w:rPr>
-        <w:t xml:space="preserve">Versión a Color (Digital):</w:t>
-      </w:r>
-      <w:r>
-        <w:rPr>
-          <w:rFonts w:ascii="Times New Roman" w:hAnsi="Times New Roman"/>
-          <w:color w:val="000000"/>
-          <w:sz w:val="23"/>
-        </w:rPr>
-        <w:t xml:space="preserve"> </w:t>
-      </w:r>
-      <w:hyperlink r:id="rId9">
-        <w:r>
-          <w:rPr>
-            <w:rStyle w:val="VerbatimChar"/>
-          </w:rPr>
-          <w:t xml:space="preserve">capitulo_cifie_xai_fom7_Revision_1_Atendido.docx</w:t>
-        </w:r>
-      </w:hyperlink>
-      <w:r>
-        <w:rPr>
-          <w:rFonts w:ascii="Times New Roman" w:hAnsi="Times New Roman"/>
-          <w:color w:val="000000"/>
-          <w:sz w:val="23"/>
-        </w:rPr>
-        <w:br/>
-      </w:r>
-      <w:r>
-        <w:rPr>
-          <w:rFonts w:ascii="Times New Roman" w:hAnsi="Times New Roman"/>
-          <w:color w:val="000000"/>
-          <w:sz w:val="23"/>
-        </w:rPr>
-        <w:t xml:space="preserve">-</w:t>
-      </w:r>
-      <w:r>
-        <w:rPr>
-          <w:rFonts w:ascii="Times New Roman" w:hAnsi="Times New Roman"/>
-          <w:color w:val="000000"/>
-          <w:sz w:val="23"/>
-        </w:rPr>
-        <w:t xml:space="preserve"> </w:t>
-      </w:r>
-      <w:r>
-        <w:rPr>
-          <w:rFonts w:ascii="Times New Roman" w:hAnsi="Times New Roman"/>
-          <w:b/>
-          <w:bCs/>
-          <w:color w:val="000000"/>
-          <w:sz w:val="23"/>
-        </w:rPr>
-        <w:t xml:space="preserve">Versión Monocromática (Impresión):</w:t>
-      </w:r>
-      <w:r>
-        <w:rPr>
-          <w:rFonts w:ascii="Times New Roman" w:hAnsi="Times New Roman"/>
-          <w:color w:val="000000"/>
-          <w:sz w:val="23"/>
-        </w:rPr>
-        <w:t xml:space="preserve"> </w:t>
-      </w:r>
-      <w:hyperlink r:id="rId10">
-        <w:r>
-          <w:rPr>
-            <w:rStyle w:val="VerbatimChar"/>
-          </w:rPr>
-          <w:t xml:space="preserve">capitulo_cifie_xai_fom7_Revision_1_Atendido_bn.docx</w:t>
-        </w:r>
-      </w:hyperlink>
     </w:p>
     <w:p>
       <w:pPr>
-        <w:spacing w:line="312" w:lineRule="auto" w:after="80"/>
+        <w:spacing w:line="312" w:lineRule="auto" w:after="100"/>
         <w:jc w:val="both"/>
       </w:pPr>
       <w:r>
@@ -460,8 +173,8 @@
     <w:p>
       <w:pPr>
         <w:pStyle w:val="FirstParagraph"/>
-        <w:spacing w:line="312" w:lineRule="auto" w:after="80"/>
-        <w:jc w:val="both"/>
+        <w:spacing w:line="276" w:lineRule="auto" w:before="40" w:after="60"/>
+        <w:jc w:val="left"/>
       </w:pPr>
       <w:r>
         <w:rPr>
@@ -475,7 +188,7 @@
     <w:p>
       <w:pPr>
         <w:pStyle w:val="BodyText"/>
-        <w:spacing w:line="312" w:lineRule="auto" w:after="80"/>
+        <w:spacing w:line="312" w:lineRule="auto" w:after="100"/>
         <w:jc w:val="both"/>
       </w:pPr>
       <w:r>
@@ -490,7 +203,7 @@
     <w:p>
       <w:pPr>
         <w:pStyle w:val="BodyText"/>
-        <w:spacing w:line="312" w:lineRule="auto" w:after="80"/>
+        <w:spacing w:line="312" w:lineRule="auto" w:after="100"/>
         <w:jc w:val="both"/>
       </w:pPr>
       <w:r>
@@ -504,7 +217,7 @@
     </w:p>
     <w:p>
       <w:pPr>
-        <w:spacing w:line="312" w:lineRule="auto" w:after="80"/>
+        <w:spacing w:line="312" w:lineRule="auto" w:after="100"/>
         <w:jc w:val="both"/>
       </w:pPr>
       <w:r>
@@ -518,11 +231,11 @@
         </w:pict>
       </w:r>
     </w:p>
-    <w:bookmarkStart w:id="11" w:name="X9ab58fe5b8787928cd65f98cbac0c01aa848961"/>
+    <w:bookmarkStart w:id="9" w:name="X9ab58fe5b8787928cd65f98cbac0c01aa848961"/>
     <w:p>
       <w:pPr>
         <w:pStyle w:val="Heading3"/>
-        <w:spacing w:before="200" w:after="80"/>
+        <w:spacing w:before="240" w:after="80"/>
         <w:jc w:val="left"/>
       </w:pPr>
       <w:r>
@@ -572,7 +285,7 @@
     <w:p>
       <w:pPr>
         <w:pStyle w:val="FirstParagraph"/>
-        <w:spacing w:line="312" w:lineRule="auto" w:after="80"/>
+        <w:spacing w:line="312" w:lineRule="auto" w:after="100"/>
         <w:jc w:val="both"/>
       </w:pPr>
       <w:r>
@@ -605,7 +318,7 @@
     <w:p>
       <w:pPr>
         <w:pStyle w:val="BodyText"/>
-        <w:spacing w:line="312" w:lineRule="auto" w:after="80"/>
+        <w:spacing w:line="312" w:lineRule="auto" w:after="100"/>
         <w:jc w:val="both"/>
       </w:pPr>
       <w:r>
@@ -1305,7 +1018,7 @@
     </w:p>
     <w:p>
       <w:pPr>
-        <w:spacing w:line="312" w:lineRule="auto" w:after="80"/>
+        <w:spacing w:line="312" w:lineRule="auto" w:after="100"/>
         <w:jc w:val="both"/>
       </w:pPr>
       <w:r>
@@ -1319,12 +1032,12 @@
         </w:pict>
       </w:r>
     </w:p>
-    <w:bookmarkEnd w:id="11"/>
-    <w:bookmarkStart w:id="12" w:name="X6475612b0aa19921728919096a995d721071d6b"/>
+    <w:bookmarkEnd w:id="9"/>
+    <w:bookmarkStart w:id="10" w:name="X6475612b0aa19921728919096a995d721071d6b"/>
     <w:p>
       <w:pPr>
         <w:pStyle w:val="Heading3"/>
-        <w:spacing w:before="200" w:after="80"/>
+        <w:spacing w:before="240" w:after="80"/>
         <w:jc w:val="left"/>
       </w:pPr>
       <w:r>
@@ -1374,7 +1087,7 @@
     <w:p>
       <w:pPr>
         <w:pStyle w:val="FirstParagraph"/>
-        <w:spacing w:line="312" w:lineRule="auto" w:after="80"/>
+        <w:spacing w:line="312" w:lineRule="auto" w:after="100"/>
         <w:jc w:val="both"/>
       </w:pPr>
       <w:r>
@@ -1407,7 +1120,7 @@
     <w:p>
       <w:pPr>
         <w:pStyle w:val="BodyText"/>
-        <w:spacing w:line="312" w:lineRule="auto" w:after="80"/>
+        <w:spacing w:line="312" w:lineRule="auto" w:after="100"/>
         <w:jc w:val="both"/>
       </w:pPr>
       <w:r>
@@ -1562,7 +1275,7 @@
     </w:p>
     <w:p>
       <w:pPr>
-        <w:spacing w:line="312" w:lineRule="auto" w:after="80"/>
+        <w:spacing w:line="312" w:lineRule="auto" w:after="100"/>
         <w:jc w:val="both"/>
       </w:pPr>
       <w:r>
@@ -1576,12 +1289,12 @@
         </w:pict>
       </w:r>
     </w:p>
-    <w:bookmarkEnd w:id="12"/>
-    <w:bookmarkStart w:id="13" w:name="X24fffea1be4e84bae3fd64ea0bcdddf03b05ff4"/>
+    <w:bookmarkEnd w:id="10"/>
+    <w:bookmarkStart w:id="11" w:name="X24fffea1be4e84bae3fd64ea0bcdddf03b05ff4"/>
     <w:p>
       <w:pPr>
         <w:pStyle w:val="Heading3"/>
-        <w:spacing w:before="200" w:after="80"/>
+        <w:spacing w:before="240" w:after="80"/>
         <w:jc w:val="left"/>
       </w:pPr>
       <w:r>
@@ -1631,7 +1344,7 @@
     <w:p>
       <w:pPr>
         <w:pStyle w:val="FirstParagraph"/>
-        <w:spacing w:line="312" w:lineRule="auto" w:after="80"/>
+        <w:spacing w:line="312" w:lineRule="auto" w:after="100"/>
         <w:jc w:val="both"/>
       </w:pPr>
       <w:r>
@@ -1664,7 +1377,7 @@
     <w:p>
       <w:pPr>
         <w:pStyle w:val="BodyText"/>
-        <w:spacing w:line="312" w:lineRule="auto" w:after="80"/>
+        <w:spacing w:line="312" w:lineRule="auto" w:after="100"/>
         <w:jc w:val="both"/>
       </w:pPr>
       <w:r>
@@ -2050,7 +1763,7 @@
     </w:p>
     <w:p>
       <w:pPr>
-        <w:spacing w:line="312" w:lineRule="auto" w:after="80"/>
+        <w:spacing w:line="312" w:lineRule="auto" w:after="100"/>
         <w:jc w:val="both"/>
       </w:pPr>
       <w:r>
@@ -2064,12 +1777,12 @@
         </w:pict>
       </w:r>
     </w:p>
-    <w:bookmarkEnd w:id="13"/>
-    <w:bookmarkStart w:id="14" w:name="X1f9cba8fd307671f2f062de8767fdfa47b72771"/>
+    <w:bookmarkEnd w:id="11"/>
+    <w:bookmarkStart w:id="12" w:name="X1f9cba8fd307671f2f062de8767fdfa47b72771"/>
     <w:p>
       <w:pPr>
         <w:pStyle w:val="Heading3"/>
-        <w:spacing w:before="200" w:after="80"/>
+        <w:spacing w:before="240" w:after="80"/>
         <w:jc w:val="left"/>
       </w:pPr>
       <w:r>
@@ -2119,7 +1832,7 @@
     <w:p>
       <w:pPr>
         <w:pStyle w:val="FirstParagraph"/>
-        <w:spacing w:line="312" w:lineRule="auto" w:after="80"/>
+        <w:spacing w:line="312" w:lineRule="auto" w:after="100"/>
         <w:jc w:val="both"/>
       </w:pPr>
       <w:r>
@@ -2152,7 +1865,7 @@
     <w:p>
       <w:pPr>
         <w:pStyle w:val="BodyText"/>
-        <w:spacing w:line="312" w:lineRule="auto" w:after="80"/>
+        <w:spacing w:line="312" w:lineRule="auto" w:after="100"/>
         <w:jc w:val="both"/>
       </w:pPr>
       <w:r>
@@ -2331,7 +2044,7 @@
     </w:p>
     <w:p>
       <w:pPr>
-        <w:spacing w:line="312" w:lineRule="auto" w:after="80"/>
+        <w:spacing w:line="312" w:lineRule="auto" w:after="100"/>
         <w:jc w:val="both"/>
       </w:pPr>
       <w:r>
@@ -2345,12 +2058,12 @@
         </w:pict>
       </w:r>
     </w:p>
-    <w:bookmarkEnd w:id="14"/>
-    <w:bookmarkStart w:id="15" w:name="X1107be17df5022e87e77f8c544fd293320ee237"/>
+    <w:bookmarkEnd w:id="12"/>
+    <w:bookmarkStart w:id="13" w:name="X1107be17df5022e87e77f8c544fd293320ee237"/>
     <w:p>
       <w:pPr>
         <w:pStyle w:val="Heading3"/>
-        <w:spacing w:before="200" w:after="80"/>
+        <w:spacing w:before="240" w:after="80"/>
         <w:jc w:val="left"/>
       </w:pPr>
       <w:r>
@@ -2400,7 +2113,7 @@
     <w:p>
       <w:pPr>
         <w:pStyle w:val="FirstParagraph"/>
-        <w:spacing w:line="312" w:lineRule="auto" w:after="80"/>
+        <w:spacing w:line="312" w:lineRule="auto" w:after="100"/>
         <w:jc w:val="both"/>
       </w:pPr>
       <w:r>
@@ -2467,7 +2180,7 @@
     <w:p>
       <w:pPr>
         <w:pStyle w:val="BodyText"/>
-        <w:spacing w:line="312" w:lineRule="auto" w:after="80"/>
+        <w:spacing w:line="312" w:lineRule="auto" w:after="100"/>
         <w:jc w:val="both"/>
       </w:pPr>
       <w:r>
@@ -2856,7 +2569,7 @@
     </w:p>
     <w:p>
       <w:pPr>
-        <w:spacing w:line="312" w:lineRule="auto" w:after="80"/>
+        <w:spacing w:line="312" w:lineRule="auto" w:after="100"/>
         <w:jc w:val="both"/>
       </w:pPr>
       <w:r>
@@ -2870,12 +2583,12 @@
         </w:pict>
       </w:r>
     </w:p>
-    <w:bookmarkEnd w:id="15"/>
-    <w:bookmarkStart w:id="19" w:name="verificación-técnica-y-salvaguardas"/>
+    <w:bookmarkEnd w:id="13"/>
+    <w:bookmarkStart w:id="17" w:name="verificación-técnica-y-salvaguardas"/>
     <w:p>
       <w:pPr>
         <w:pStyle w:val="Heading3"/>
-        <w:spacing w:before="200" w:after="80"/>
+        <w:spacing w:before="240" w:after="80"/>
         <w:jc w:val="left"/>
       </w:pPr>
       <w:r>
@@ -2893,7 +2606,7 @@
           <w:ilvl w:val="0"/>
           <w:numId w:val="1001"/>
         </w:numPr>
-        <w:spacing w:line="312" w:lineRule="auto" w:after="80"/>
+        <w:spacing w:line="312" w:lineRule="auto" w:after="100"/>
         <w:jc w:val="both"/>
       </w:pPr>
       <w:r>
@@ -2930,7 +2643,7 @@
         </w:rPr>
         <w:t xml:space="preserve"> </w:t>
       </w:r>
-      <w:hyperlink r:id="rId16">
+      <w:hyperlink r:id="rId14">
         <w:r>
           <w:rPr>
             <w:rStyle w:val="VerbatimChar"/>
@@ -2954,7 +2667,7 @@
           <w:ilvl w:val="0"/>
           <w:numId w:val="1001"/>
         </w:numPr>
-        <w:spacing w:line="312" w:lineRule="auto" w:after="80"/>
+        <w:spacing w:line="312" w:lineRule="auto" w:after="100"/>
         <w:jc w:val="both"/>
       </w:pPr>
       <w:r>
@@ -2975,7 +2688,7 @@
         </w:rPr>
         <w:t xml:space="preserve"> </w:t>
       </w:r>
-      <w:hyperlink r:id="rId17">
+      <w:hyperlink r:id="rId15">
         <w:r>
           <w:rPr>
             <w:rStyle w:val="VerbatimChar"/>
@@ -3007,7 +2720,7 @@
           <w:ilvl w:val="0"/>
           <w:numId w:val="1001"/>
         </w:numPr>
-        <w:spacing w:line="312" w:lineRule="auto" w:after="80"/>
+        <w:spacing w:line="312" w:lineRule="auto" w:after="100"/>
         <w:jc w:val="both"/>
       </w:pPr>
       <w:r>
@@ -3044,7 +2757,7 @@
         </w:rPr>
         <w:t xml:space="preserve"> </w:t>
       </w:r>
-      <w:hyperlink r:id="rId18">
+      <w:hyperlink r:id="rId16">
         <w:r>
           <w:rPr>
             <w:rStyle w:val="VerbatimChar"/>
@@ -3064,7 +2777,7 @@
     <w:p>
       <w:pPr>
         <w:pStyle w:val="FirstParagraph"/>
-        <w:spacing w:line="312" w:lineRule="auto" w:after="80"/>
+        <w:spacing w:line="312" w:lineRule="auto" w:after="100"/>
         <w:jc w:val="both"/>
       </w:pPr>
       <w:r>
@@ -3079,8 +2792,8 @@
     <w:p>
       <w:pPr>
         <w:pStyle w:val="BodyText"/>
-        <w:spacing w:line="312" w:lineRule="auto" w:after="80"/>
-        <w:jc w:val="both"/>
+        <w:spacing w:line="276" w:lineRule="auto" w:before="40" w:after="60"/>
+        <w:jc w:val="left"/>
       </w:pPr>
       <w:r>
         <w:rPr>
@@ -3094,8 +2807,8 @@
     <w:p>
       <w:pPr>
         <w:pStyle w:val="BodyText"/>
-        <w:spacing w:line="312" w:lineRule="auto" w:after="80"/>
-        <w:jc w:val="both"/>
+        <w:spacing w:line="276" w:lineRule="auto" w:before="40" w:after="60"/>
+        <w:jc w:val="left"/>
       </w:pPr>
       <w:r>
         <w:rPr>
@@ -3156,8 +2869,8 @@
         <w:t xml:space="preserve">24 de octubre de 2026</w:t>
       </w:r>
     </w:p>
-    <w:bookmarkEnd w:id="19"/>
-    <w:bookmarkEnd w:id="20"/>
+    <w:bookmarkEnd w:id="17"/>
+    <w:bookmarkEnd w:id="18"/>
     <w:sectPr>
       <w:footnotePr>
         <w:numRestart w:val="eachSect"/>

</xml_diff>

<commit_message>
docs(cifie): fix alignment for reviewer comments and author response labels
</commit_message>
<xml_diff>
--- a/publications/book_chapters/2026_cifie_xai_fom7/drafts/v5_revision_1/RESPUESTA_A_REVISORES_REVISION_1.docx
+++ b/publications/book_chapters/2026_cifie_xai_fom7/drafts/v5_revision_1/RESPUESTA_A_REVISORES_REVISION_1.docx
@@ -20,7 +20,7 @@
     <w:p>
       <w:pPr>
         <w:pStyle w:val="FirstParagraph"/>
-        <w:spacing w:line="276" w:lineRule="auto" w:before="40" w:after="60"/>
+        <w:spacing w:before="40" w:after="60" w:line="276" w:lineRule="auto"/>
         <w:jc w:val="left"/>
       </w:pPr>
       <w:r>
@@ -173,7 +173,7 @@
     <w:p>
       <w:pPr>
         <w:pStyle w:val="FirstParagraph"/>
-        <w:spacing w:line="276" w:lineRule="auto" w:before="40" w:after="60"/>
+        <w:spacing w:before="40" w:after="60" w:line="276" w:lineRule="auto"/>
         <w:jc w:val="left"/>
       </w:pPr>
       <w:r>
@@ -248,29 +248,28 @@
     </w:p>
     <w:p>
       <w:pPr>
+        <w:pStyle w:val="FirstParagraph"/>
+        <w:spacing w:before="160" w:after="40" w:line="276" w:lineRule="auto"/>
+        <w:jc w:val="left"/>
+      </w:pPr>
+      <w:r>
+        <w:rPr>
+          <w:rFonts w:ascii="Times New Roman" w:hAnsi="Times New Roman"/>
+          <w:b/>
+          <w:bCs/>
+          <w:color w:val="000000"/>
+          <w:sz w:val="23"/>
+        </w:rPr>
+        <w:t xml:space="preserve">Comentario de la Editora:</w:t>
+      </w:r>
+    </w:p>
+    <w:p>
+      <w:pPr>
         <w:pStyle w:val="BlockText"/>
-        <w:spacing w:line="276" w:lineRule="auto" w:before="80" w:after="80"/>
+        <w:spacing w:line="276" w:lineRule="auto" w:before="80" w:after="120"/>
         <w:ind w:left="576" w:right="288"/>
         <w:jc w:val="both"/>
       </w:pPr>
-      <w:r>
-        <w:rPr>
-          <w:rFonts w:ascii="Times New Roman" w:hAnsi="Times New Roman"/>
-          <w:b/>
-          <w:bCs/>
-          <w:color w:val="000000"/>
-          <w:sz w:val="21"/>
-        </w:rPr>
-        <w:t xml:space="preserve">Comentario de la Editora:</w:t>
-      </w:r>
-      <w:r>
-        <w:rPr>
-          <w:rFonts w:ascii="Times New Roman" w:hAnsi="Times New Roman"/>
-          <w:color w:val="000000"/>
-          <w:sz w:val="21"/>
-        </w:rPr>
-        <w:br/>
-      </w:r>
       <w:r>
         <w:rPr>
           <w:rFonts w:ascii="Times New Roman" w:hAnsi="Times New Roman"/>
@@ -285,8 +284,8 @@
     <w:p>
       <w:pPr>
         <w:pStyle w:val="FirstParagraph"/>
-        <w:spacing w:line="312" w:lineRule="auto" w:after="100"/>
-        <w:jc w:val="both"/>
+        <w:spacing w:before="160" w:after="40" w:line="276" w:lineRule="auto"/>
+        <w:jc w:val="left"/>
       </w:pPr>
       <w:r>
         <w:rPr>
@@ -297,22 +296,6 @@
           <w:sz w:val="23"/>
         </w:rPr>
         <w:t xml:space="preserve">Respuesta del Autor:</w:t>
-      </w:r>
-      <w:r>
-        <w:rPr>
-          <w:rFonts w:ascii="Times New Roman" w:hAnsi="Times New Roman"/>
-          <w:color w:val="000000"/>
-          <w:sz w:val="23"/>
-        </w:rPr>
-        <w:br/>
-      </w:r>
-      <w:r>
-        <w:rPr>
-          <w:rFonts w:ascii="Times New Roman" w:hAnsi="Times New Roman"/>
-          <w:color w:val="000000"/>
-          <w:sz w:val="23"/>
-        </w:rPr>
-        <w:t xml:space="preserve">Se acepta plenamente la observación. Comparto la apreciación de que presentar las siete compuertas del marco teórico de gobernanza junto con las cinco métricas tabulares del benchmark sin un deslinde explícito podía inducir a error al lector respecto al nivel de comprobación de cada componente.</w:t>
       </w:r>
     </w:p>
     <w:p>
@@ -324,6 +307,21 @@
       <w:r>
         <w:rPr>
           <w:rFonts w:ascii="Times New Roman" w:hAnsi="Times New Roman"/>
+          <w:color w:val="000000"/>
+          <w:sz w:val="23"/>
+        </w:rPr>
+        <w:t xml:space="preserve">Se acepta plenamente la observación. Comparto la apreciación de que presentar las siete compuertas del marco teórico de gobernanza junto con las cinco métricas tabulares del benchmark sin un deslinde explícito podía inducir a error al lector respecto al nivel de comprobación de cada componente.</w:t>
+      </w:r>
+    </w:p>
+    <w:p>
+      <w:pPr>
+        <w:pStyle w:val="BodyText"/>
+        <w:spacing w:before="160" w:after="40" w:line="276" w:lineRule="auto"/>
+        <w:jc w:val="left"/>
+      </w:pPr>
+      <w:r>
+        <w:rPr>
+          <w:rFonts w:ascii="Times New Roman" w:hAnsi="Times New Roman"/>
           <w:b/>
           <w:bCs/>
           <w:color w:val="000000"/>
@@ -331,30 +329,17 @@
         </w:rPr>
         <w:t xml:space="preserve">Modificaciones realizadas:</w:t>
       </w:r>
-      <w:r>
-        <w:rPr>
-          <w:rFonts w:ascii="Times New Roman" w:hAnsi="Times New Roman"/>
-          <w:color w:val="000000"/>
-          <w:sz w:val="23"/>
-        </w:rPr>
-        <w:t xml:space="preserve"> </w:t>
-      </w:r>
-      <w:r>
-        <w:rPr>
-          <w:rFonts w:ascii="Times New Roman" w:hAnsi="Times New Roman"/>
-          <w:color w:val="000000"/>
-          <w:sz w:val="23"/>
-        </w:rPr>
-        <w:t xml:space="preserve">1.</w:t>
-      </w:r>
-      <w:r>
-        <w:rPr>
-          <w:rFonts w:ascii="Times New Roman" w:hAnsi="Times New Roman"/>
-          <w:color w:val="000000"/>
-          <w:sz w:val="23"/>
-        </w:rPr>
-        <w:t xml:space="preserve"> </w:t>
-      </w:r>
+    </w:p>
+    <w:p>
+      <w:pPr>
+        <w:pStyle w:val="Compact"/>
+        <w:numPr>
+          <w:ilvl w:val="0"/>
+          <w:numId w:val="1001"/>
+        </w:numPr>
+        <w:spacing w:line="312" w:lineRule="auto" w:after="100"/>
+        <w:jc w:val="both"/>
+      </w:pPr>
       <w:r>
         <w:rPr>
           <w:rFonts w:ascii="Times New Roman" w:hAnsi="Times New Roman"/>
@@ -428,30 +413,17 @@
         </w:rPr>
         <w:t xml:space="preserve">, donde se formalizan tres niveles de verificación técnica:</w:t>
       </w:r>
-      <w:r>
-        <w:rPr>
-          <w:rFonts w:ascii="Times New Roman" w:hAnsi="Times New Roman"/>
-          <w:color w:val="000000"/>
-          <w:sz w:val="23"/>
-        </w:rPr>
-        <w:t xml:space="preserve"> </w:t>
-      </w:r>
-      <w:r>
-        <w:rPr>
-          <w:rFonts w:ascii="Times New Roman" w:hAnsi="Times New Roman"/>
-          <w:color w:val="000000"/>
-          <w:sz w:val="23"/>
-        </w:rPr>
-        <w:t xml:space="preserve">-</w:t>
-      </w:r>
-      <w:r>
-        <w:rPr>
-          <w:rFonts w:ascii="Times New Roman" w:hAnsi="Times New Roman"/>
-          <w:color w:val="000000"/>
-          <w:sz w:val="23"/>
-        </w:rPr>
-        <w:t xml:space="preserve"> </w:t>
-      </w:r>
+    </w:p>
+    <w:p>
+      <w:pPr>
+        <w:pStyle w:val="Compact"/>
+        <w:numPr>
+          <w:ilvl w:val="1"/>
+          <w:numId w:val="1002"/>
+        </w:numPr>
+        <w:spacing w:line="312" w:lineRule="auto" w:after="100"/>
+        <w:jc w:val="both"/>
+      </w:pPr>
       <w:r>
         <w:rPr>
           <w:rFonts w:ascii="Times New Roman" w:hAnsi="Times New Roman"/>
@@ -571,30 +543,17 @@
         </w:rPr>
         <w:t xml:space="preserve">).</w:t>
       </w:r>
-      <w:r>
-        <w:rPr>
-          <w:rFonts w:ascii="Times New Roman" w:hAnsi="Times New Roman"/>
-          <w:color w:val="000000"/>
-          <w:sz w:val="23"/>
-        </w:rPr>
-        <w:t xml:space="preserve"> </w:t>
-      </w:r>
-      <w:r>
-        <w:rPr>
-          <w:rFonts w:ascii="Times New Roman" w:hAnsi="Times New Roman"/>
-          <w:color w:val="000000"/>
-          <w:sz w:val="23"/>
-        </w:rPr>
-        <w:t xml:space="preserve">-</w:t>
-      </w:r>
-      <w:r>
-        <w:rPr>
-          <w:rFonts w:ascii="Times New Roman" w:hAnsi="Times New Roman"/>
-          <w:color w:val="000000"/>
-          <w:sz w:val="23"/>
-        </w:rPr>
-        <w:t xml:space="preserve"> </w:t>
-      </w:r>
+    </w:p>
+    <w:p>
+      <w:pPr>
+        <w:pStyle w:val="Compact"/>
+        <w:numPr>
+          <w:ilvl w:val="1"/>
+          <w:numId w:val="1002"/>
+        </w:numPr>
+        <w:spacing w:line="312" w:lineRule="auto" w:after="100"/>
+        <w:jc w:val="both"/>
+      </w:pPr>
       <w:r>
         <w:rPr>
           <w:rFonts w:ascii="Times New Roman" w:hAnsi="Times New Roman"/>
@@ -643,30 +602,17 @@
         </w:rPr>
         <w:t xml:space="preserve">), evaluadas a través de la cobertura empírica en Anchors y la tasa de generación factible en DiCE dentro del inventario calificado de celdas.</w:t>
       </w:r>
-      <w:r>
-        <w:rPr>
-          <w:rFonts w:ascii="Times New Roman" w:hAnsi="Times New Roman"/>
-          <w:color w:val="000000"/>
-          <w:sz w:val="23"/>
-        </w:rPr>
-        <w:t xml:space="preserve"> </w:t>
-      </w:r>
-      <w:r>
-        <w:rPr>
-          <w:rFonts w:ascii="Times New Roman" w:hAnsi="Times New Roman"/>
-          <w:color w:val="000000"/>
-          <w:sz w:val="23"/>
-        </w:rPr>
-        <w:t xml:space="preserve">-</w:t>
-      </w:r>
-      <w:r>
-        <w:rPr>
-          <w:rFonts w:ascii="Times New Roman" w:hAnsi="Times New Roman"/>
-          <w:color w:val="000000"/>
-          <w:sz w:val="23"/>
-        </w:rPr>
-        <w:t xml:space="preserve"> </w:t>
-      </w:r>
+    </w:p>
+    <w:p>
+      <w:pPr>
+        <w:pStyle w:val="Compact"/>
+        <w:numPr>
+          <w:ilvl w:val="1"/>
+          <w:numId w:val="1002"/>
+        </w:numPr>
+        <w:spacing w:line="312" w:lineRule="auto" w:after="100"/>
+        <w:jc w:val="both"/>
+      </w:pPr>
       <w:r>
         <w:rPr>
           <w:rFonts w:ascii="Times New Roman" w:hAnsi="Times New Roman"/>
@@ -737,30 +683,17 @@
         </w:rPr>
         <w:t xml:space="preserve">), delimitadas como compuertas del diseño general del marco no sometidas a contrastes de hipótesis en este benchmark factorial.</w:t>
       </w:r>
-      <w:r>
-        <w:rPr>
-          <w:rFonts w:ascii="Times New Roman" w:hAnsi="Times New Roman"/>
-          <w:color w:val="000000"/>
-          <w:sz w:val="23"/>
-        </w:rPr>
-        <w:t xml:space="preserve"> </w:t>
-      </w:r>
-      <w:r>
-        <w:rPr>
-          <w:rFonts w:ascii="Times New Roman" w:hAnsi="Times New Roman"/>
-          <w:color w:val="000000"/>
-          <w:sz w:val="23"/>
-        </w:rPr>
-        <w:t xml:space="preserve">2.</w:t>
-      </w:r>
-      <w:r>
-        <w:rPr>
-          <w:rFonts w:ascii="Times New Roman" w:hAnsi="Times New Roman"/>
-          <w:color w:val="000000"/>
-          <w:sz w:val="23"/>
-        </w:rPr>
-        <w:t xml:space="preserve"> </w:t>
-      </w:r>
+    </w:p>
+    <w:p>
+      <w:pPr>
+        <w:pStyle w:val="Compact"/>
+        <w:numPr>
+          <w:ilvl w:val="0"/>
+          <w:numId w:val="1001"/>
+        </w:numPr>
+        <w:spacing w:line="312" w:lineRule="auto" w:after="100"/>
+        <w:jc w:val="both"/>
+      </w:pPr>
       <w:r>
         <w:rPr>
           <w:rFonts w:ascii="Times New Roman" w:hAnsi="Times New Roman"/>
@@ -834,30 +767,17 @@
         </w:rPr>
         <w:t xml:space="preserve">, explicitando este mapeo previo a la presentación de la Tabla 1.</w:t>
       </w:r>
-      <w:r>
-        <w:rPr>
-          <w:rFonts w:ascii="Times New Roman" w:hAnsi="Times New Roman"/>
-          <w:color w:val="000000"/>
-          <w:sz w:val="23"/>
-        </w:rPr>
-        <w:t xml:space="preserve"> </w:t>
-      </w:r>
-      <w:r>
-        <w:rPr>
-          <w:rFonts w:ascii="Times New Roman" w:hAnsi="Times New Roman"/>
-          <w:color w:val="000000"/>
-          <w:sz w:val="23"/>
-        </w:rPr>
-        <w:t xml:space="preserve">3.</w:t>
-      </w:r>
-      <w:r>
-        <w:rPr>
-          <w:rFonts w:ascii="Times New Roman" w:hAnsi="Times New Roman"/>
-          <w:color w:val="000000"/>
-          <w:sz w:val="23"/>
-        </w:rPr>
-        <w:t xml:space="preserve"> </w:t>
-      </w:r>
+    </w:p>
+    <w:p>
+      <w:pPr>
+        <w:pStyle w:val="Compact"/>
+        <w:numPr>
+          <w:ilvl w:val="0"/>
+          <w:numId w:val="1001"/>
+        </w:numPr>
+        <w:spacing w:line="312" w:lineRule="auto" w:after="100"/>
+        <w:jc w:val="both"/>
+      </w:pPr>
       <w:r>
         <w:rPr>
           <w:rFonts w:ascii="Times New Roman" w:hAnsi="Times New Roman"/>
@@ -1050,29 +970,28 @@
     </w:p>
     <w:p>
       <w:pPr>
+        <w:pStyle w:val="FirstParagraph"/>
+        <w:spacing w:before="160" w:after="40" w:line="276" w:lineRule="auto"/>
+        <w:jc w:val="left"/>
+      </w:pPr>
+      <w:r>
+        <w:rPr>
+          <w:rFonts w:ascii="Times New Roman" w:hAnsi="Times New Roman"/>
+          <w:b/>
+          <w:bCs/>
+          <w:color w:val="000000"/>
+          <w:sz w:val="23"/>
+        </w:rPr>
+        <w:t xml:space="preserve">Comentario de la Editora:</w:t>
+      </w:r>
+    </w:p>
+    <w:p>
+      <w:pPr>
         <w:pStyle w:val="BlockText"/>
-        <w:spacing w:line="276" w:lineRule="auto" w:before="80" w:after="80"/>
+        <w:spacing w:line="276" w:lineRule="auto" w:before="80" w:after="120"/>
         <w:ind w:left="576" w:right="288"/>
         <w:jc w:val="both"/>
       </w:pPr>
-      <w:r>
-        <w:rPr>
-          <w:rFonts w:ascii="Times New Roman" w:hAnsi="Times New Roman"/>
-          <w:b/>
-          <w:bCs/>
-          <w:color w:val="000000"/>
-          <w:sz w:val="21"/>
-        </w:rPr>
-        <w:t xml:space="preserve">Comentario de la Editora:</w:t>
-      </w:r>
-      <w:r>
-        <w:rPr>
-          <w:rFonts w:ascii="Times New Roman" w:hAnsi="Times New Roman"/>
-          <w:color w:val="000000"/>
-          <w:sz w:val="21"/>
-        </w:rPr>
-        <w:br/>
-      </w:r>
       <w:r>
         <w:rPr>
           <w:rFonts w:ascii="Times New Roman" w:hAnsi="Times New Roman"/>
@@ -1087,8 +1006,8 @@
     <w:p>
       <w:pPr>
         <w:pStyle w:val="FirstParagraph"/>
-        <w:spacing w:line="312" w:lineRule="auto" w:after="100"/>
-        <w:jc w:val="both"/>
+        <w:spacing w:before="160" w:after="40" w:line="276" w:lineRule="auto"/>
+        <w:jc w:val="left"/>
       </w:pPr>
       <w:r>
         <w:rPr>
@@ -1099,22 +1018,6 @@
           <w:sz w:val="23"/>
         </w:rPr>
         <w:t xml:space="preserve">Respuesta del Autor:</w:t>
-      </w:r>
-      <w:r>
-        <w:rPr>
-          <w:rFonts w:ascii="Times New Roman" w:hAnsi="Times New Roman"/>
-          <w:color w:val="000000"/>
-          <w:sz w:val="23"/>
-        </w:rPr>
-        <w:br/>
-      </w:r>
-      <w:r>
-        <w:rPr>
-          <w:rFonts w:ascii="Times New Roman" w:hAnsi="Times New Roman"/>
-          <w:color w:val="000000"/>
-          <w:sz w:val="23"/>
-        </w:rPr>
-        <w:t xml:space="preserve">Coincido enteramente con la apreciación. La afirmación original constituía una sobrestimación metodológica, dado que el determinismo numérico en arquitecturas computacionales modernas involucra múltiples capas más allá de una semilla pseudoaleatoria de inicialización.</w:t>
       </w:r>
     </w:p>
     <w:p>
@@ -1126,6 +1029,21 @@
       <w:r>
         <w:rPr>
           <w:rFonts w:ascii="Times New Roman" w:hAnsi="Times New Roman"/>
+          <w:color w:val="000000"/>
+          <w:sz w:val="23"/>
+        </w:rPr>
+        <w:t xml:space="preserve">Coincido enteramente con la apreciación. La afirmación original constituía una sobrestimación metodológica, dado que el determinismo numérico en arquitecturas computacionales modernas involucra múltiples capas más allá de una semilla pseudoaleatoria de inicialización.</w:t>
+      </w:r>
+    </w:p>
+    <w:p>
+      <w:pPr>
+        <w:pStyle w:val="BodyText"/>
+        <w:spacing w:before="160" w:after="40" w:line="276" w:lineRule="auto"/>
+        <w:jc w:val="left"/>
+      </w:pPr>
+      <w:r>
+        <w:rPr>
+          <w:rFonts w:ascii="Times New Roman" w:hAnsi="Times New Roman"/>
           <w:b/>
           <w:bCs/>
           <w:color w:val="000000"/>
@@ -1133,30 +1051,17 @@
         </w:rPr>
         <w:t xml:space="preserve">Modificaciones realizadas:</w:t>
       </w:r>
-      <w:r>
-        <w:rPr>
-          <w:rFonts w:ascii="Times New Roman" w:hAnsi="Times New Roman"/>
-          <w:color w:val="000000"/>
-          <w:sz w:val="23"/>
-        </w:rPr>
-        <w:t xml:space="preserve"> </w:t>
-      </w:r>
-      <w:r>
-        <w:rPr>
-          <w:rFonts w:ascii="Times New Roman" w:hAnsi="Times New Roman"/>
-          <w:color w:val="000000"/>
-          <w:sz w:val="23"/>
-        </w:rPr>
-        <w:t xml:space="preserve">1.</w:t>
-      </w:r>
-      <w:r>
-        <w:rPr>
-          <w:rFonts w:ascii="Times New Roman" w:hAnsi="Times New Roman"/>
-          <w:color w:val="000000"/>
-          <w:sz w:val="23"/>
-        </w:rPr>
-        <w:t xml:space="preserve"> </w:t>
-      </w:r>
+    </w:p>
+    <w:p>
+      <w:pPr>
+        <w:pStyle w:val="Compact"/>
+        <w:numPr>
+          <w:ilvl w:val="0"/>
+          <w:numId w:val="1003"/>
+        </w:numPr>
+        <w:spacing w:line="312" w:lineRule="auto" w:after="100"/>
+        <w:jc w:val="both"/>
+      </w:pPr>
       <w:r>
         <w:rPr>
           <w:rFonts w:ascii="Times New Roman" w:hAnsi="Times New Roman"/>
@@ -1256,21 +1161,24 @@
         </w:rPr>
         <w:t xml:space="preserve">.</w:t>
       </w:r>
-      <w:r>
-        <w:rPr>
-          <w:rFonts w:ascii="Times New Roman" w:hAnsi="Times New Roman"/>
-          <w:color w:val="000000"/>
-          <w:sz w:val="23"/>
-        </w:rPr>
-        <w:t xml:space="preserve"> </w:t>
-      </w:r>
-      <w:r>
-        <w:rPr>
-          <w:rFonts w:ascii="Times New Roman" w:hAnsi="Times New Roman"/>
-          <w:color w:val="000000"/>
-          <w:sz w:val="23"/>
-        </w:rPr>
-        <w:t xml:space="preserve">2. Se documentaron explícitamente las cuatro salvaguardas empleadas: (a) protocolo determinista multillave de cinco semillas (42, 123, 456, 789, 999) para medir y acotar la dispersión estocástica inter-ejecución; (b) congelación estricta de versiones de bibliotecas en entornos virtuales aislados; (c) preprocesadores deterministas ajustados sin fuga de datos; y (d) disponibilidad pública de código y artefactos con identificadores DOI persistentes.</w:t>
+    </w:p>
+    <w:p>
+      <w:pPr>
+        <w:pStyle w:val="Compact"/>
+        <w:numPr>
+          <w:ilvl w:val="0"/>
+          <w:numId w:val="1003"/>
+        </w:numPr>
+        <w:spacing w:line="312" w:lineRule="auto" w:after="100"/>
+        <w:jc w:val="both"/>
+      </w:pPr>
+      <w:r>
+        <w:rPr>
+          <w:rFonts w:ascii="Times New Roman" w:hAnsi="Times New Roman"/>
+          <w:color w:val="000000"/>
+          <w:sz w:val="23"/>
+        </w:rPr>
+        <w:t xml:space="preserve">Se documentaron explícitamente las cuatro salvaguardas empleadas: (a) protocolo determinista multillave de cinco semillas (42, 123, 456, 789, 999) para medir y acotar la dispersión estocástica inter-ejecución; (b) congelación estricta de versiones de bibliotecas en entornos virtuales aislados; (c) preprocesadores deterministas ajustados sin fuga de datos; y (d) disponibilidad pública de código y artefactos con identificadores DOI persistentes.</w:t>
       </w:r>
     </w:p>
     <w:p>
@@ -1307,29 +1215,28 @@
     </w:p>
     <w:p>
       <w:pPr>
+        <w:pStyle w:val="FirstParagraph"/>
+        <w:spacing w:before="160" w:after="40" w:line="276" w:lineRule="auto"/>
+        <w:jc w:val="left"/>
+      </w:pPr>
+      <w:r>
+        <w:rPr>
+          <w:rFonts w:ascii="Times New Roman" w:hAnsi="Times New Roman"/>
+          <w:b/>
+          <w:bCs/>
+          <w:color w:val="000000"/>
+          <w:sz w:val="23"/>
+        </w:rPr>
+        <w:t xml:space="preserve">Comentario de la Editora:</w:t>
+      </w:r>
+    </w:p>
+    <w:p>
+      <w:pPr>
         <w:pStyle w:val="BlockText"/>
-        <w:spacing w:line="276" w:lineRule="auto" w:before="80" w:after="80"/>
+        <w:spacing w:line="276" w:lineRule="auto" w:before="80" w:after="120"/>
         <w:ind w:left="576" w:right="288"/>
         <w:jc w:val="both"/>
       </w:pPr>
-      <w:r>
-        <w:rPr>
-          <w:rFonts w:ascii="Times New Roman" w:hAnsi="Times New Roman"/>
-          <w:b/>
-          <w:bCs/>
-          <w:color w:val="000000"/>
-          <w:sz w:val="21"/>
-        </w:rPr>
-        <w:t xml:space="preserve">Comentario de la Editora:</w:t>
-      </w:r>
-      <w:r>
-        <w:rPr>
-          <w:rFonts w:ascii="Times New Roman" w:hAnsi="Times New Roman"/>
-          <w:color w:val="000000"/>
-          <w:sz w:val="21"/>
-        </w:rPr>
-        <w:br/>
-      </w:r>
       <w:r>
         <w:rPr>
           <w:rFonts w:ascii="Times New Roman" w:hAnsi="Times New Roman"/>
@@ -1344,8 +1251,8 @@
     <w:p>
       <w:pPr>
         <w:pStyle w:val="FirstParagraph"/>
-        <w:spacing w:line="312" w:lineRule="auto" w:after="100"/>
-        <w:jc w:val="both"/>
+        <w:spacing w:before="160" w:after="40" w:line="276" w:lineRule="auto"/>
+        <w:jc w:val="left"/>
       </w:pPr>
       <w:r>
         <w:rPr>
@@ -1356,22 +1263,6 @@
           <w:sz w:val="23"/>
         </w:rPr>
         <w:t xml:space="preserve">Respuesta del Autor:</w:t>
-      </w:r>
-      <w:r>
-        <w:rPr>
-          <w:rFonts w:ascii="Times New Roman" w:hAnsi="Times New Roman"/>
-          <w:color w:val="000000"/>
-          <w:sz w:val="23"/>
-        </w:rPr>
-        <w:br/>
-      </w:r>
-      <w:r>
-        <w:rPr>
-          <w:rFonts w:ascii="Times New Roman" w:hAnsi="Times New Roman"/>
-          <w:color w:val="000000"/>
-          <w:sz w:val="23"/>
-        </w:rPr>
-        <w:t xml:space="preserve">Se acepta plenamente la recomendación. Es imperativo para la integridad científica y editorial distinguir con absoluta transparencia los resultados tomados de publicaciones previas frente a las aportaciones conceptuales y analíticas que se publican por primera vez en este volumen colectivo.</w:t>
       </w:r>
     </w:p>
     <w:p>
@@ -1383,6 +1274,21 @@
       <w:r>
         <w:rPr>
           <w:rFonts w:ascii="Times New Roman" w:hAnsi="Times New Roman"/>
+          <w:color w:val="000000"/>
+          <w:sz w:val="23"/>
+        </w:rPr>
+        <w:t xml:space="preserve">Se acepta plenamente la recomendación. Es imperativo para la integridad científica y editorial distinguir con absoluta transparencia los resultados tomados de publicaciones previas frente a las aportaciones conceptuales y analíticas que se publican por primera vez en este volumen colectivo.</w:t>
+      </w:r>
+    </w:p>
+    <w:p>
+      <w:pPr>
+        <w:pStyle w:val="BodyText"/>
+        <w:spacing w:before="160" w:after="40" w:line="276" w:lineRule="auto"/>
+        <w:jc w:val="left"/>
+      </w:pPr>
+      <w:r>
+        <w:rPr>
+          <w:rFonts w:ascii="Times New Roman" w:hAnsi="Times New Roman"/>
           <w:b/>
           <w:bCs/>
           <w:color w:val="000000"/>
@@ -1390,30 +1296,17 @@
         </w:rPr>
         <w:t xml:space="preserve">Modificaciones realizadas:</w:t>
       </w:r>
-      <w:r>
-        <w:rPr>
-          <w:rFonts w:ascii="Times New Roman" w:hAnsi="Times New Roman"/>
-          <w:color w:val="000000"/>
-          <w:sz w:val="23"/>
-        </w:rPr>
-        <w:t xml:space="preserve"> </w:t>
-      </w:r>
-      <w:r>
-        <w:rPr>
-          <w:rFonts w:ascii="Times New Roman" w:hAnsi="Times New Roman"/>
-          <w:color w:val="000000"/>
-          <w:sz w:val="23"/>
-        </w:rPr>
-        <w:t xml:space="preserve">1.</w:t>
-      </w:r>
-      <w:r>
-        <w:rPr>
-          <w:rFonts w:ascii="Times New Roman" w:hAnsi="Times New Roman"/>
-          <w:color w:val="000000"/>
-          <w:sz w:val="23"/>
-        </w:rPr>
-        <w:t xml:space="preserve"> </w:t>
-      </w:r>
+    </w:p>
+    <w:p>
+      <w:pPr>
+        <w:pStyle w:val="Compact"/>
+        <w:numPr>
+          <w:ilvl w:val="0"/>
+          <w:numId w:val="1004"/>
+        </w:numPr>
+        <w:spacing w:line="312" w:lineRule="auto" w:after="100"/>
+        <w:jc w:val="both"/>
+      </w:pPr>
       <w:r>
         <w:rPr>
           <w:rFonts w:ascii="Times New Roman" w:hAnsi="Times New Roman"/>
@@ -1487,30 +1380,17 @@
         </w:rPr>
         <w:t xml:space="preserve">, desglosando con nitidez tres niveles de precedencia:</w:t>
       </w:r>
-      <w:r>
-        <w:rPr>
-          <w:rFonts w:ascii="Times New Roman" w:hAnsi="Times New Roman"/>
-          <w:color w:val="000000"/>
-          <w:sz w:val="23"/>
-        </w:rPr>
-        <w:t xml:space="preserve"> </w:t>
-      </w:r>
-      <w:r>
-        <w:rPr>
-          <w:rFonts w:ascii="Times New Roman" w:hAnsi="Times New Roman"/>
-          <w:color w:val="000000"/>
-          <w:sz w:val="23"/>
-        </w:rPr>
-        <w:t xml:space="preserve">-</w:t>
-      </w:r>
-      <w:r>
-        <w:rPr>
-          <w:rFonts w:ascii="Times New Roman" w:hAnsi="Times New Roman"/>
-          <w:color w:val="000000"/>
-          <w:sz w:val="23"/>
-        </w:rPr>
-        <w:t xml:space="preserve"> </w:t>
-      </w:r>
+    </w:p>
+    <w:p>
+      <w:pPr>
+        <w:pStyle w:val="Compact"/>
+        <w:numPr>
+          <w:ilvl w:val="1"/>
+          <w:numId w:val="1005"/>
+        </w:numPr>
+        <w:spacing w:line="312" w:lineRule="auto" w:after="100"/>
+        <w:jc w:val="both"/>
+      </w:pPr>
       <w:r>
         <w:rPr>
           <w:rFonts w:ascii="Times New Roman" w:hAnsi="Times New Roman"/>
@@ -1537,30 +1417,17 @@
         </w:rPr>
         <w:t xml:space="preserve">Contrastes de hipótesis H1 y H2 tomados de Herrera-Vásquez &amp; Herrero-Uceda (2026, RIMI); descriptivos de reproducibilidad P1 del repositorio experimental de la tesis doctoral de Herrera-Vásquez (2026).</w:t>
       </w:r>
-      <w:r>
-        <w:rPr>
-          <w:rFonts w:ascii="Times New Roman" w:hAnsi="Times New Roman"/>
-          <w:color w:val="000000"/>
-          <w:sz w:val="23"/>
-        </w:rPr>
-        <w:t xml:space="preserve"> </w:t>
-      </w:r>
-      <w:r>
-        <w:rPr>
-          <w:rFonts w:ascii="Times New Roman" w:hAnsi="Times New Roman"/>
-          <w:color w:val="000000"/>
-          <w:sz w:val="23"/>
-        </w:rPr>
-        <w:t xml:space="preserve">-</w:t>
-      </w:r>
-      <w:r>
-        <w:rPr>
-          <w:rFonts w:ascii="Times New Roman" w:hAnsi="Times New Roman"/>
-          <w:color w:val="000000"/>
-          <w:sz w:val="23"/>
-        </w:rPr>
-        <w:t xml:space="preserve"> </w:t>
-      </w:r>
+    </w:p>
+    <w:p>
+      <w:pPr>
+        <w:pStyle w:val="Compact"/>
+        <w:numPr>
+          <w:ilvl w:val="1"/>
+          <w:numId w:val="1005"/>
+        </w:numPr>
+        <w:spacing w:line="312" w:lineRule="auto" w:after="100"/>
+        <w:jc w:val="both"/>
+      </w:pPr>
       <w:r>
         <w:rPr>
           <w:rFonts w:ascii="Times New Roman" w:hAnsi="Times New Roman"/>
@@ -1587,30 +1454,17 @@
         </w:rPr>
         <w:t xml:space="preserve">La convergencia y comparación cuatripartita simultánea (LIME, SHAP, Anchors, DiCE) bajo un prisma analítico unificado que concilia objetos explicativos dispares (sustitutos lineales, valores de Shapley, reglas lógicas y contrafactuales).</w:t>
       </w:r>
-      <w:r>
-        <w:rPr>
-          <w:rFonts w:ascii="Times New Roman" w:hAnsi="Times New Roman"/>
-          <w:color w:val="000000"/>
-          <w:sz w:val="23"/>
-        </w:rPr>
-        <w:t xml:space="preserve"> </w:t>
-      </w:r>
-      <w:r>
-        <w:rPr>
-          <w:rFonts w:ascii="Times New Roman" w:hAnsi="Times New Roman"/>
-          <w:color w:val="000000"/>
-          <w:sz w:val="23"/>
-        </w:rPr>
-        <w:t xml:space="preserve">-</w:t>
-      </w:r>
-      <w:r>
-        <w:rPr>
-          <w:rFonts w:ascii="Times New Roman" w:hAnsi="Times New Roman"/>
-          <w:color w:val="000000"/>
-          <w:sz w:val="23"/>
-        </w:rPr>
-        <w:t xml:space="preserve"> </w:t>
-      </w:r>
+    </w:p>
+    <w:p>
+      <w:pPr>
+        <w:pStyle w:val="Compact"/>
+        <w:numPr>
+          <w:ilvl w:val="1"/>
+          <w:numId w:val="1005"/>
+        </w:numPr>
+        <w:spacing w:line="312" w:lineRule="auto" w:after="100"/>
+        <w:jc w:val="both"/>
+      </w:pPr>
       <w:r>
         <w:rPr>
           <w:rFonts w:ascii="Times New Roman" w:hAnsi="Times New Roman"/>
@@ -1655,30 +1509,17 @@
         </w:rPr>
         <w:t xml:space="preserve">) para despliegue productivo; y (iv) La articulación de criterios de evaluación técnica alineados con la Ley de Inteligencia Artificial de la UE y el marco NIST AI RMF.</w:t>
       </w:r>
-      <w:r>
-        <w:rPr>
-          <w:rFonts w:ascii="Times New Roman" w:hAnsi="Times New Roman"/>
-          <w:color w:val="000000"/>
-          <w:sz w:val="23"/>
-        </w:rPr>
-        <w:t xml:space="preserve"> </w:t>
-      </w:r>
-      <w:r>
-        <w:rPr>
-          <w:rFonts w:ascii="Times New Roman" w:hAnsi="Times New Roman"/>
-          <w:color w:val="000000"/>
-          <w:sz w:val="23"/>
-        </w:rPr>
-        <w:t xml:space="preserve">2.</w:t>
-      </w:r>
-      <w:r>
-        <w:rPr>
-          <w:rFonts w:ascii="Times New Roman" w:hAnsi="Times New Roman"/>
-          <w:color w:val="000000"/>
-          <w:sz w:val="23"/>
-        </w:rPr>
-        <w:t xml:space="preserve"> </w:t>
-      </w:r>
+    </w:p>
+    <w:p>
+      <w:pPr>
+        <w:pStyle w:val="Compact"/>
+        <w:numPr>
+          <w:ilvl w:val="0"/>
+          <w:numId w:val="1004"/>
+        </w:numPr>
+        <w:spacing w:line="312" w:lineRule="auto" w:after="100"/>
+        <w:jc w:val="both"/>
+      </w:pPr>
       <w:r>
         <w:rPr>
           <w:rFonts w:ascii="Times New Roman" w:hAnsi="Times New Roman"/>
@@ -1795,29 +1636,28 @@
     </w:p>
     <w:p>
       <w:pPr>
+        <w:pStyle w:val="FirstParagraph"/>
+        <w:spacing w:before="160" w:after="40" w:line="276" w:lineRule="auto"/>
+        <w:jc w:val="left"/>
+      </w:pPr>
+      <w:r>
+        <w:rPr>
+          <w:rFonts w:ascii="Times New Roman" w:hAnsi="Times New Roman"/>
+          <w:b/>
+          <w:bCs/>
+          <w:color w:val="000000"/>
+          <w:sz w:val="23"/>
+        </w:rPr>
+        <w:t xml:space="preserve">Comentario de la Editora:</w:t>
+      </w:r>
+    </w:p>
+    <w:p>
+      <w:pPr>
         <w:pStyle w:val="BlockText"/>
-        <w:spacing w:line="276" w:lineRule="auto" w:before="80" w:after="80"/>
+        <w:spacing w:line="276" w:lineRule="auto" w:before="80" w:after="120"/>
         <w:ind w:left="576" w:right="288"/>
         <w:jc w:val="both"/>
       </w:pPr>
-      <w:r>
-        <w:rPr>
-          <w:rFonts w:ascii="Times New Roman" w:hAnsi="Times New Roman"/>
-          <w:b/>
-          <w:bCs/>
-          <w:color w:val="000000"/>
-          <w:sz w:val="21"/>
-        </w:rPr>
-        <w:t xml:space="preserve">Comentario de la Editora:</w:t>
-      </w:r>
-      <w:r>
-        <w:rPr>
-          <w:rFonts w:ascii="Times New Roman" w:hAnsi="Times New Roman"/>
-          <w:color w:val="000000"/>
-          <w:sz w:val="21"/>
-        </w:rPr>
-        <w:br/>
-      </w:r>
       <w:r>
         <w:rPr>
           <w:rFonts w:ascii="Times New Roman" w:hAnsi="Times New Roman"/>
@@ -1832,8 +1672,8 @@
     <w:p>
       <w:pPr>
         <w:pStyle w:val="FirstParagraph"/>
-        <w:spacing w:line="312" w:lineRule="auto" w:after="100"/>
-        <w:jc w:val="both"/>
+        <w:spacing w:before="160" w:after="40" w:line="276" w:lineRule="auto"/>
+        <w:jc w:val="left"/>
       </w:pPr>
       <w:r>
         <w:rPr>
@@ -1844,22 +1684,6 @@
           <w:sz w:val="23"/>
         </w:rPr>
         <w:t xml:space="preserve">Respuesta del Autor:</w:t>
-      </w:r>
-      <w:r>
-        <w:rPr>
-          <w:rFonts w:ascii="Times New Roman" w:hAnsi="Times New Roman"/>
-          <w:color w:val="000000"/>
-          <w:sz w:val="23"/>
-        </w:rPr>
-        <w:br/>
-      </w:r>
-      <w:r>
-        <w:rPr>
-          <w:rFonts w:ascii="Times New Roman" w:hAnsi="Times New Roman"/>
-          <w:color w:val="000000"/>
-          <w:sz w:val="23"/>
-        </w:rPr>
-        <w:t xml:space="preserve">Comparto enteramente este criterio de prudencia epistémica. El empleo de «certificación» en un trabajo de benchmarking experimental computacional puede sugerir erróneamente un procedimiento normativo de acreditación legal o regulatoria.</w:t>
       </w:r>
     </w:p>
     <w:p>
@@ -1871,6 +1695,21 @@
       <w:r>
         <w:rPr>
           <w:rFonts w:ascii="Times New Roman" w:hAnsi="Times New Roman"/>
+          <w:color w:val="000000"/>
+          <w:sz w:val="23"/>
+        </w:rPr>
+        <w:t xml:space="preserve">Comparto enteramente este criterio de prudencia epistémica. El empleo de «certificación» en un trabajo de benchmarking experimental computacional puede sugerir erróneamente un procedimiento normativo de acreditación legal o regulatoria.</w:t>
+      </w:r>
+    </w:p>
+    <w:p>
+      <w:pPr>
+        <w:pStyle w:val="BodyText"/>
+        <w:spacing w:before="160" w:after="40" w:line="276" w:lineRule="auto"/>
+        <w:jc w:val="left"/>
+      </w:pPr>
+      <w:r>
+        <w:rPr>
+          <w:rFonts w:ascii="Times New Roman" w:hAnsi="Times New Roman"/>
           <w:b/>
           <w:bCs/>
           <w:color w:val="000000"/>
@@ -1878,30 +1717,17 @@
         </w:rPr>
         <w:t xml:space="preserve">Modificaciones realizadas:</w:t>
       </w:r>
-      <w:r>
-        <w:rPr>
-          <w:rFonts w:ascii="Times New Roman" w:hAnsi="Times New Roman"/>
-          <w:color w:val="000000"/>
-          <w:sz w:val="23"/>
-        </w:rPr>
-        <w:t xml:space="preserve"> </w:t>
-      </w:r>
-      <w:r>
-        <w:rPr>
-          <w:rFonts w:ascii="Times New Roman" w:hAnsi="Times New Roman"/>
-          <w:color w:val="000000"/>
-          <w:sz w:val="23"/>
-        </w:rPr>
-        <w:t xml:space="preserve">1.</w:t>
-      </w:r>
-      <w:r>
-        <w:rPr>
-          <w:rFonts w:ascii="Times New Roman" w:hAnsi="Times New Roman"/>
-          <w:color w:val="000000"/>
-          <w:sz w:val="23"/>
-        </w:rPr>
-        <w:t xml:space="preserve"> </w:t>
-      </w:r>
+    </w:p>
+    <w:p>
+      <w:pPr>
+        <w:pStyle w:val="Compact"/>
+        <w:numPr>
+          <w:ilvl w:val="0"/>
+          <w:numId w:val="1006"/>
+        </w:numPr>
+        <w:spacing w:line="312" w:lineRule="auto" w:after="100"/>
+        <w:jc w:val="both"/>
+      </w:pPr>
       <w:r>
         <w:rPr>
           <w:rFonts w:ascii="Times New Roman" w:hAnsi="Times New Roman"/>
@@ -1928,46 +1754,36 @@
         </w:rPr>
         <w:t xml:space="preserve">Se eliminaron las instancias donde «certificar» o «certificación» se aplicaban al protocolo FOM-7 o a la evaluación experimental del benchmark, sustituyéndolas por «verificación técnica computacional», «evaluación empírica controlada» o «criterios de aceptación técnica».</w:t>
       </w:r>
-      <w:r>
-        <w:rPr>
-          <w:rFonts w:ascii="Times New Roman" w:hAnsi="Times New Roman"/>
-          <w:color w:val="000000"/>
-          <w:sz w:val="23"/>
-        </w:rPr>
-        <w:t xml:space="preserve"> </w:t>
-      </w:r>
-      <w:r>
-        <w:rPr>
-          <w:rFonts w:ascii="Times New Roman" w:hAnsi="Times New Roman"/>
-          <w:color w:val="000000"/>
-          <w:sz w:val="23"/>
-        </w:rPr>
-        <w:t xml:space="preserve">2. Se reservó el término «certificación» exclusivamente para discusiones de evaluación de conformidad jurídica formal (e.g., evaluación de conformidad bajo el Reglamento de IA de la UE).</w:t>
-      </w:r>
-      <w:r>
-        <w:rPr>
-          <w:rFonts w:ascii="Times New Roman" w:hAnsi="Times New Roman"/>
-          <w:color w:val="000000"/>
-          <w:sz w:val="23"/>
-        </w:rPr>
-        <w:t xml:space="preserve"> </w:t>
-      </w:r>
-      <w:r>
-        <w:rPr>
-          <w:rFonts w:ascii="Times New Roman" w:hAnsi="Times New Roman"/>
-          <w:color w:val="000000"/>
-          <w:sz w:val="23"/>
-        </w:rPr>
-        <w:t xml:space="preserve">3.</w:t>
-      </w:r>
-      <w:r>
-        <w:rPr>
-          <w:rFonts w:ascii="Times New Roman" w:hAnsi="Times New Roman"/>
-          <w:color w:val="000000"/>
-          <w:sz w:val="23"/>
-        </w:rPr>
-        <w:t xml:space="preserve"> </w:t>
-      </w:r>
+    </w:p>
+    <w:p>
+      <w:pPr>
+        <w:pStyle w:val="Compact"/>
+        <w:numPr>
+          <w:ilvl w:val="0"/>
+          <w:numId w:val="1006"/>
+        </w:numPr>
+        <w:spacing w:line="312" w:lineRule="auto" w:after="100"/>
+        <w:jc w:val="both"/>
+      </w:pPr>
+      <w:r>
+        <w:rPr>
+          <w:rFonts w:ascii="Times New Roman" w:hAnsi="Times New Roman"/>
+          <w:color w:val="000000"/>
+          <w:sz w:val="23"/>
+        </w:rPr>
+        <w:t xml:space="preserve">Se reservó el término «certificación» exclusivamente para discusiones de evaluación de conformidad jurídica formal (e.g., evaluación de conformidad bajo el Reglamento de IA de la UE).</w:t>
+      </w:r>
+    </w:p>
+    <w:p>
+      <w:pPr>
+        <w:pStyle w:val="Compact"/>
+        <w:numPr>
+          <w:ilvl w:val="0"/>
+          <w:numId w:val="1006"/>
+        </w:numPr>
+        <w:spacing w:line="312" w:lineRule="auto" w:after="100"/>
+        <w:jc w:val="both"/>
+      </w:pPr>
       <w:r>
         <w:rPr>
           <w:rFonts w:ascii="Times New Roman" w:hAnsi="Times New Roman"/>
@@ -2076,29 +1892,28 @@
     </w:p>
     <w:p>
       <w:pPr>
+        <w:pStyle w:val="FirstParagraph"/>
+        <w:spacing w:before="160" w:after="40" w:line="276" w:lineRule="auto"/>
+        <w:jc w:val="left"/>
+      </w:pPr>
+      <w:r>
+        <w:rPr>
+          <w:rFonts w:ascii="Times New Roman" w:hAnsi="Times New Roman"/>
+          <w:b/>
+          <w:bCs/>
+          <w:color w:val="000000"/>
+          <w:sz w:val="23"/>
+        </w:rPr>
+        <w:t xml:space="preserve">Comentario de la Editora:</w:t>
+      </w:r>
+    </w:p>
+    <w:p>
+      <w:pPr>
         <w:pStyle w:val="BlockText"/>
-        <w:spacing w:line="276" w:lineRule="auto" w:before="80" w:after="80"/>
+        <w:spacing w:line="276" w:lineRule="auto" w:before="80" w:after="120"/>
         <w:ind w:left="576" w:right="288"/>
         <w:jc w:val="both"/>
       </w:pPr>
-      <w:r>
-        <w:rPr>
-          <w:rFonts w:ascii="Times New Roman" w:hAnsi="Times New Roman"/>
-          <w:b/>
-          <w:bCs/>
-          <w:color w:val="000000"/>
-          <w:sz w:val="21"/>
-        </w:rPr>
-        <w:t xml:space="preserve">Comentario de la Editora:</w:t>
-      </w:r>
-      <w:r>
-        <w:rPr>
-          <w:rFonts w:ascii="Times New Roman" w:hAnsi="Times New Roman"/>
-          <w:color w:val="000000"/>
-          <w:sz w:val="21"/>
-        </w:rPr>
-        <w:br/>
-      </w:r>
       <w:r>
         <w:rPr>
           <w:rFonts w:ascii="Times New Roman" w:hAnsi="Times New Roman"/>
@@ -2113,27 +1928,26 @@
     <w:p>
       <w:pPr>
         <w:pStyle w:val="FirstParagraph"/>
+        <w:spacing w:before="160" w:after="40" w:line="276" w:lineRule="auto"/>
+        <w:jc w:val="left"/>
+      </w:pPr>
+      <w:r>
+        <w:rPr>
+          <w:rFonts w:ascii="Times New Roman" w:hAnsi="Times New Roman"/>
+          <w:b/>
+          <w:bCs/>
+          <w:color w:val="000000"/>
+          <w:sz w:val="23"/>
+        </w:rPr>
+        <w:t xml:space="preserve">Respuesta del Autor:</w:t>
+      </w:r>
+    </w:p>
+    <w:p>
+      <w:pPr>
+        <w:pStyle w:val="BodyText"/>
         <w:spacing w:line="312" w:lineRule="auto" w:after="100"/>
         <w:jc w:val="both"/>
       </w:pPr>
-      <w:r>
-        <w:rPr>
-          <w:rFonts w:ascii="Times New Roman" w:hAnsi="Times New Roman"/>
-          <w:b/>
-          <w:bCs/>
-          <w:color w:val="000000"/>
-          <w:sz w:val="23"/>
-        </w:rPr>
-        <w:t xml:space="preserve">Respuesta del Autor:</w:t>
-      </w:r>
-      <w:r>
-        <w:rPr>
-          <w:rFonts w:ascii="Times New Roman" w:hAnsi="Times New Roman"/>
-          <w:color w:val="000000"/>
-          <w:sz w:val="23"/>
-        </w:rPr>
-        <w:br/>
-      </w:r>
       <w:r>
         <w:rPr>
           <w:rFonts w:ascii="Times New Roman" w:hAnsi="Times New Roman"/>
@@ -2180,6 +1994,27 @@
     <w:p>
       <w:pPr>
         <w:pStyle w:val="BodyText"/>
+        <w:spacing w:before="160" w:after="40" w:line="276" w:lineRule="auto"/>
+        <w:jc w:val="left"/>
+      </w:pPr>
+      <w:r>
+        <w:rPr>
+          <w:rFonts w:ascii="Times New Roman" w:hAnsi="Times New Roman"/>
+          <w:b/>
+          <w:bCs/>
+          <w:color w:val="000000"/>
+          <w:sz w:val="23"/>
+        </w:rPr>
+        <w:t xml:space="preserve">Modificaciones realizadas:</w:t>
+      </w:r>
+    </w:p>
+    <w:p>
+      <w:pPr>
+        <w:pStyle w:val="Compact"/>
+        <w:numPr>
+          <w:ilvl w:val="0"/>
+          <w:numId w:val="1007"/>
+        </w:numPr>
         <w:spacing w:line="312" w:lineRule="auto" w:after="100"/>
         <w:jc w:val="both"/>
       </w:pPr>
@@ -2191,40 +2026,6 @@
           <w:color w:val="000000"/>
           <w:sz w:val="23"/>
         </w:rPr>
-        <w:t xml:space="preserve">Modificaciones realizadas:</w:t>
-      </w:r>
-      <w:r>
-        <w:rPr>
-          <w:rFonts w:ascii="Times New Roman" w:hAnsi="Times New Roman"/>
-          <w:color w:val="000000"/>
-          <w:sz w:val="23"/>
-        </w:rPr>
-        <w:t xml:space="preserve"> </w:t>
-      </w:r>
-      <w:r>
-        <w:rPr>
-          <w:rFonts w:ascii="Times New Roman" w:hAnsi="Times New Roman"/>
-          <w:color w:val="000000"/>
-          <w:sz w:val="23"/>
-        </w:rPr>
-        <w:t xml:space="preserve">1.</w:t>
-      </w:r>
-      <w:r>
-        <w:rPr>
-          <w:rFonts w:ascii="Times New Roman" w:hAnsi="Times New Roman"/>
-          <w:color w:val="000000"/>
-          <w:sz w:val="23"/>
-        </w:rPr>
-        <w:t xml:space="preserve"> </w:t>
-      </w:r>
-      <w:r>
-        <w:rPr>
-          <w:rFonts w:ascii="Times New Roman" w:hAnsi="Times New Roman"/>
-          <w:b/>
-          <w:bCs/>
-          <w:color w:val="000000"/>
-          <w:sz w:val="23"/>
-        </w:rPr>
         <w:t xml:space="preserve">Sección 10 (</w:t>
       </w:r>
       <w:r>
@@ -2264,30 +2065,17 @@
         </w:rPr>
         <w:t xml:space="preserve">Se organizó la sección en dos bloques nítidamente articulados:</w:t>
       </w:r>
-      <w:r>
-        <w:rPr>
-          <w:rFonts w:ascii="Times New Roman" w:hAnsi="Times New Roman"/>
-          <w:color w:val="000000"/>
-          <w:sz w:val="23"/>
-        </w:rPr>
-        <w:t xml:space="preserve"> </w:t>
-      </w:r>
-      <w:r>
-        <w:rPr>
-          <w:rFonts w:ascii="Times New Roman" w:hAnsi="Times New Roman"/>
-          <w:color w:val="000000"/>
-          <w:sz w:val="23"/>
-        </w:rPr>
-        <w:t xml:space="preserve">-</w:t>
-      </w:r>
-      <w:r>
-        <w:rPr>
-          <w:rFonts w:ascii="Times New Roman" w:hAnsi="Times New Roman"/>
-          <w:color w:val="000000"/>
-          <w:sz w:val="23"/>
-        </w:rPr>
-        <w:t xml:space="preserve"> </w:t>
-      </w:r>
+    </w:p>
+    <w:p>
+      <w:pPr>
+        <w:pStyle w:val="Compact"/>
+        <w:numPr>
+          <w:ilvl w:val="1"/>
+          <w:numId w:val="1008"/>
+        </w:numPr>
+        <w:spacing w:line="312" w:lineRule="auto" w:after="100"/>
+        <w:jc w:val="both"/>
+      </w:pPr>
       <w:r>
         <w:rPr>
           <w:rFonts w:ascii="Times New Roman" w:hAnsi="Times New Roman"/>
@@ -2306,30 +2094,17 @@
         </w:rPr>
         <w:t xml:space="preserve">, estructurado punto por punto en los cuatro ejes señalados por la editora:</w:t>
       </w:r>
-      <w:r>
-        <w:rPr>
-          <w:rFonts w:ascii="Times New Roman" w:hAnsi="Times New Roman"/>
-          <w:color w:val="000000"/>
-          <w:sz w:val="23"/>
-        </w:rPr>
-        <w:t xml:space="preserve"> </w:t>
-      </w:r>
-      <w:r>
-        <w:rPr>
-          <w:rFonts w:ascii="Times New Roman" w:hAnsi="Times New Roman"/>
-          <w:color w:val="000000"/>
-          <w:sz w:val="23"/>
-        </w:rPr>
-        <w:t xml:space="preserve">1.</w:t>
-      </w:r>
-      <w:r>
-        <w:rPr>
-          <w:rFonts w:ascii="Times New Roman" w:hAnsi="Times New Roman"/>
-          <w:color w:val="000000"/>
-          <w:sz w:val="23"/>
-        </w:rPr>
-        <w:t xml:space="preserve"> </w:t>
-      </w:r>
+    </w:p>
+    <w:p>
+      <w:pPr>
+        <w:pStyle w:val="Compact"/>
+        <w:numPr>
+          <w:ilvl w:val="2"/>
+          <w:numId w:val="1009"/>
+        </w:numPr>
+        <w:spacing w:line="312" w:lineRule="auto" w:after="100"/>
+        <w:jc w:val="both"/>
+      </w:pPr>
       <w:r>
         <w:rPr>
           <w:rFonts w:ascii="Times New Roman" w:hAnsi="Times New Roman"/>
@@ -2356,30 +2131,17 @@
         </w:rPr>
         <w:t xml:space="preserve">Explicación de la justificación metodológica de control y reconocimiento explícito de la imposibilidad de extrapolar a visión, PLN, audio o grafos.</w:t>
       </w:r>
-      <w:r>
-        <w:rPr>
-          <w:rFonts w:ascii="Times New Roman" w:hAnsi="Times New Roman"/>
-          <w:color w:val="000000"/>
-          <w:sz w:val="23"/>
-        </w:rPr>
-        <w:t xml:space="preserve"> </w:t>
-      </w:r>
-      <w:r>
-        <w:rPr>
-          <w:rFonts w:ascii="Times New Roman" w:hAnsi="Times New Roman"/>
-          <w:color w:val="000000"/>
-          <w:sz w:val="23"/>
-        </w:rPr>
-        <w:t xml:space="preserve">2.</w:t>
-      </w:r>
-      <w:r>
-        <w:rPr>
-          <w:rFonts w:ascii="Times New Roman" w:hAnsi="Times New Roman"/>
-          <w:color w:val="000000"/>
-          <w:sz w:val="23"/>
-        </w:rPr>
-        <w:t xml:space="preserve"> </w:t>
-      </w:r>
+    </w:p>
+    <w:p>
+      <w:pPr>
+        <w:pStyle w:val="Compact"/>
+        <w:numPr>
+          <w:ilvl w:val="2"/>
+          <w:numId w:val="1009"/>
+        </w:numPr>
+        <w:spacing w:line="312" w:lineRule="auto" w:after="100"/>
+        <w:jc w:val="both"/>
+      </w:pPr>
       <w:r>
         <w:rPr>
           <w:rFonts w:ascii="Times New Roman" w:hAnsi="Times New Roman"/>
@@ -2406,30 +2168,17 @@
         </w:rPr>
         <w:t xml:space="preserve">Discusión de los supuestos del enmascaramiento univariado frente a ROAR y de la similitud coseno frente a métricas Lipschitz o robustez adversarial.</w:t>
       </w:r>
-      <w:r>
-        <w:rPr>
-          <w:rFonts w:ascii="Times New Roman" w:hAnsi="Times New Roman"/>
-          <w:color w:val="000000"/>
-          <w:sz w:val="23"/>
-        </w:rPr>
-        <w:t xml:space="preserve"> </w:t>
-      </w:r>
-      <w:r>
-        <w:rPr>
-          <w:rFonts w:ascii="Times New Roman" w:hAnsi="Times New Roman"/>
-          <w:color w:val="000000"/>
-          <w:sz w:val="23"/>
-        </w:rPr>
-        <w:t xml:space="preserve">3.</w:t>
-      </w:r>
-      <w:r>
-        <w:rPr>
-          <w:rFonts w:ascii="Times New Roman" w:hAnsi="Times New Roman"/>
-          <w:color w:val="000000"/>
-          <w:sz w:val="23"/>
-        </w:rPr>
-        <w:t xml:space="preserve"> </w:t>
-      </w:r>
+    </w:p>
+    <w:p>
+      <w:pPr>
+        <w:pStyle w:val="Compact"/>
+        <w:numPr>
+          <w:ilvl w:val="2"/>
+          <w:numId w:val="1009"/>
+        </w:numPr>
+        <w:spacing w:line="312" w:lineRule="auto" w:after="100"/>
+        <w:jc w:val="both"/>
+      </w:pPr>
       <w:r>
         <w:rPr>
           <w:rFonts w:ascii="Times New Roman" w:hAnsi="Times New Roman"/>
@@ -2456,30 +2205,17 @@
         </w:rPr>
         <w:t xml:space="preserve">Delimitación formal de que no se evalúa comprensión cognitiva, confianza calibrada ni reducción de carga mental en operadores humanos (Niveles 1 y 2).</w:t>
       </w:r>
-      <w:r>
-        <w:rPr>
-          <w:rFonts w:ascii="Times New Roman" w:hAnsi="Times New Roman"/>
-          <w:color w:val="000000"/>
-          <w:sz w:val="23"/>
-        </w:rPr>
-        <w:t xml:space="preserve"> </w:t>
-      </w:r>
-      <w:r>
-        <w:rPr>
-          <w:rFonts w:ascii="Times New Roman" w:hAnsi="Times New Roman"/>
-          <w:color w:val="000000"/>
-          <w:sz w:val="23"/>
-        </w:rPr>
-        <w:t xml:space="preserve">4.</w:t>
-      </w:r>
-      <w:r>
-        <w:rPr>
-          <w:rFonts w:ascii="Times New Roman" w:hAnsi="Times New Roman"/>
-          <w:color w:val="000000"/>
-          <w:sz w:val="23"/>
-        </w:rPr>
-        <w:t xml:space="preserve"> </w:t>
-      </w:r>
+    </w:p>
+    <w:p>
+      <w:pPr>
+        <w:pStyle w:val="Compact"/>
+        <w:numPr>
+          <w:ilvl w:val="2"/>
+          <w:numId w:val="1009"/>
+        </w:numPr>
+        <w:spacing w:line="312" w:lineRule="auto" w:after="100"/>
+        <w:jc w:val="both"/>
+      </w:pPr>
       <w:r>
         <w:rPr>
           <w:rFonts w:ascii="Times New Roman" w:hAnsi="Times New Roman"/>
@@ -2524,30 +2260,17 @@
         </w:rPr>
         <w:t xml:space="preserve">), latencia concurrente en microservicios, restricciones regulatorias específicas de sector o fragilidad ante ataques adversariales orientados a manipular la explicación (scaffolding). Asimismo, la cobertura incompleta observada en métodos basados en búsqueda estocástica (Anchors y DiCE) revela barreras de escalabilidad y compatibilidad que condicionan su aplicabilidad productiva.</w:t>
       </w:r>
-      <w:r>
-        <w:rPr>
-          <w:rFonts w:ascii="Times New Roman" w:hAnsi="Times New Roman"/>
-          <w:color w:val="000000"/>
-          <w:sz w:val="23"/>
-        </w:rPr>
-        <w:t xml:space="preserve"> </w:t>
-      </w:r>
-      <w:r>
-        <w:rPr>
-          <w:rFonts w:ascii="Times New Roman" w:hAnsi="Times New Roman"/>
-          <w:color w:val="000000"/>
-          <w:sz w:val="23"/>
-        </w:rPr>
-        <w:t xml:space="preserve">-</w:t>
-      </w:r>
-      <w:r>
-        <w:rPr>
-          <w:rFonts w:ascii="Times New Roman" w:hAnsi="Times New Roman"/>
-          <w:color w:val="000000"/>
-          <w:sz w:val="23"/>
-        </w:rPr>
-        <w:t xml:space="preserve"> </w:t>
-      </w:r>
+    </w:p>
+    <w:p>
+      <w:pPr>
+        <w:pStyle w:val="Compact"/>
+        <w:numPr>
+          <w:ilvl w:val="1"/>
+          <w:numId w:val="1008"/>
+        </w:numPr>
+        <w:spacing w:line="312" w:lineRule="auto" w:after="100"/>
+        <w:jc w:val="both"/>
+      </w:pPr>
       <w:r>
         <w:rPr>
           <w:rFonts w:ascii="Times New Roman" w:hAnsi="Times New Roman"/>
@@ -2604,7 +2327,7 @@
         <w:pStyle w:val="Compact"/>
         <w:numPr>
           <w:ilvl w:val="0"/>
-          <w:numId w:val="1001"/>
+          <w:numId w:val="1010"/>
         </w:numPr>
         <w:spacing w:line="312" w:lineRule="auto" w:after="100"/>
         <w:jc w:val="both"/>
@@ -2665,7 +2388,7 @@
         <w:pStyle w:val="Compact"/>
         <w:numPr>
           <w:ilvl w:val="0"/>
-          <w:numId w:val="1001"/>
+          <w:numId w:val="1010"/>
         </w:numPr>
         <w:spacing w:line="312" w:lineRule="auto" w:after="100"/>
         <w:jc w:val="both"/>
@@ -2718,7 +2441,7 @@
         <w:pStyle w:val="Compact"/>
         <w:numPr>
           <w:ilvl w:val="0"/>
-          <w:numId w:val="1001"/>
+          <w:numId w:val="1010"/>
         </w:numPr>
         <w:spacing w:line="312" w:lineRule="auto" w:after="100"/>
         <w:jc w:val="both"/>
@@ -2792,7 +2515,7 @@
     <w:p>
       <w:pPr>
         <w:pStyle w:val="BodyText"/>
-        <w:spacing w:line="276" w:lineRule="auto" w:before="40" w:after="60"/>
+        <w:spacing w:before="40" w:after="60" w:line="276" w:lineRule="auto"/>
         <w:jc w:val="left"/>
       </w:pPr>
       <w:r>
@@ -2807,7 +2530,7 @@
     <w:p>
       <w:pPr>
         <w:pStyle w:val="BodyText"/>
-        <w:spacing w:line="276" w:lineRule="auto" w:before="40" w:after="60"/>
+        <w:spacing w:before="40" w:after="60" w:line="276" w:lineRule="auto"/>
         <w:jc w:val="left"/>
       </w:pPr>
       <w:r>
@@ -2983,6 +2706,91 @@
       </w:pPr>
     </w:lvl>
   </w:abstractNum>
+  <w:abstractNum w:abstractNumId="99411">
+    <w:nsid w:val="00A99411"/>
+    <w:multiLevelType w:val="multilevel"/>
+    <w:lvl w:ilvl="0">
+      <w:start w:val="1"/>
+      <w:numFmt w:val="decimal"/>
+      <w:lvlText w:val="%1."/>
+      <w:lvlJc w:val="left"/>
+      <w:pPr>
+        <w:ind w:left="720" w:hanging="360"/>
+      </w:pPr>
+    </w:lvl>
+    <w:lvl w:ilvl="1">
+      <w:start w:val="1"/>
+      <w:numFmt w:val="decimal"/>
+      <w:lvlText w:val="%2."/>
+      <w:lvlJc w:val="left"/>
+      <w:pPr>
+        <w:ind w:left="1440" w:hanging="360"/>
+      </w:pPr>
+    </w:lvl>
+    <w:lvl w:ilvl="2">
+      <w:start w:val="1"/>
+      <w:numFmt w:val="decimal"/>
+      <w:lvlText w:val="%3."/>
+      <w:lvlJc w:val="left"/>
+      <w:pPr>
+        <w:ind w:left="2160" w:hanging="360"/>
+      </w:pPr>
+    </w:lvl>
+    <w:lvl w:ilvl="3">
+      <w:start w:val="1"/>
+      <w:numFmt w:val="decimal"/>
+      <w:lvlText w:val="%4."/>
+      <w:lvlJc w:val="left"/>
+      <w:pPr>
+        <w:ind w:left="2880" w:hanging="360"/>
+      </w:pPr>
+    </w:lvl>
+    <w:lvl w:ilvl="4">
+      <w:start w:val="1"/>
+      <w:numFmt w:val="decimal"/>
+      <w:lvlText w:val="%5."/>
+      <w:lvlJc w:val="left"/>
+      <w:pPr>
+        <w:ind w:left="3600" w:hanging="360"/>
+      </w:pPr>
+    </w:lvl>
+    <w:lvl w:ilvl="5">
+      <w:start w:val="1"/>
+      <w:numFmt w:val="decimal"/>
+      <w:lvlText w:val="%6."/>
+      <w:lvlJc w:val="left"/>
+      <w:pPr>
+        <w:ind w:left="4320" w:hanging="360"/>
+      </w:pPr>
+    </w:lvl>
+    <w:lvl w:ilvl="6">
+      <w:start w:val="1"/>
+      <w:numFmt w:val="decimal"/>
+      <w:lvlText w:val="%7."/>
+      <w:lvlJc w:val="left"/>
+      <w:pPr>
+        <w:ind w:left="5040" w:hanging="360"/>
+      </w:pPr>
+    </w:lvl>
+    <w:lvl w:ilvl="7">
+      <w:start w:val="1"/>
+      <w:numFmt w:val="decimal"/>
+      <w:lvlText w:val="%8."/>
+      <w:lvlJc w:val="left"/>
+      <w:pPr>
+        <w:ind w:left="5760" w:hanging="360"/>
+      </w:pPr>
+    </w:lvl>
+    <w:lvl w:ilvl="8">
+      <w:start w:val="1"/>
+      <w:numFmt w:val="decimal"/>
+      <w:lvlText w:val="%9."/>
+      <w:lvlJc w:val="left"/>
+      <w:pPr>
+        <w:ind w:left="6480" w:hanging="360"/>
+      </w:pPr>
+    </w:lvl>
+  </w:abstractNum>
   <w:abstractNum w:abstractNumId="991">
     <w:nsid w:val="0000A991"/>
     <w:multiLevelType w:val="multilevel"/>
@@ -3090,6 +2898,195 @@
     <w:abstractNumId w:val="990"/>
   </w:num>
   <w:num w:numId="1001">
+    <w:abstractNumId w:val="99411"/>
+    <w:lvlOverride w:ilvl="0">
+      <w:startOverride w:val="1"/>
+    </w:lvlOverride>
+    <w:lvlOverride w:ilvl="1">
+      <w:startOverride w:val="1"/>
+    </w:lvlOverride>
+    <w:lvlOverride w:ilvl="2">
+      <w:startOverride w:val="1"/>
+    </w:lvlOverride>
+    <w:lvlOverride w:ilvl="3">
+      <w:startOverride w:val="1"/>
+    </w:lvlOverride>
+    <w:lvlOverride w:ilvl="4">
+      <w:startOverride w:val="1"/>
+    </w:lvlOverride>
+    <w:lvlOverride w:ilvl="5">
+      <w:startOverride w:val="1"/>
+    </w:lvlOverride>
+    <w:lvlOverride w:ilvl="6">
+      <w:startOverride w:val="1"/>
+    </w:lvlOverride>
+    <w:lvlOverride w:ilvl="7">
+      <w:startOverride w:val="1"/>
+    </w:lvlOverride>
+    <w:lvlOverride w:ilvl="8">
+      <w:startOverride w:val="1"/>
+    </w:lvlOverride>
+  </w:num>
+  <w:num w:numId="1002">
+    <w:abstractNumId w:val="991"/>
+  </w:num>
+  <w:num w:numId="1003">
+    <w:abstractNumId w:val="99411"/>
+    <w:lvlOverride w:ilvl="0">
+      <w:startOverride w:val="1"/>
+    </w:lvlOverride>
+    <w:lvlOverride w:ilvl="1">
+      <w:startOverride w:val="1"/>
+    </w:lvlOverride>
+    <w:lvlOverride w:ilvl="2">
+      <w:startOverride w:val="1"/>
+    </w:lvlOverride>
+    <w:lvlOverride w:ilvl="3">
+      <w:startOverride w:val="1"/>
+    </w:lvlOverride>
+    <w:lvlOverride w:ilvl="4">
+      <w:startOverride w:val="1"/>
+    </w:lvlOverride>
+    <w:lvlOverride w:ilvl="5">
+      <w:startOverride w:val="1"/>
+    </w:lvlOverride>
+    <w:lvlOverride w:ilvl="6">
+      <w:startOverride w:val="1"/>
+    </w:lvlOverride>
+    <w:lvlOverride w:ilvl="7">
+      <w:startOverride w:val="1"/>
+    </w:lvlOverride>
+    <w:lvlOverride w:ilvl="8">
+      <w:startOverride w:val="1"/>
+    </w:lvlOverride>
+  </w:num>
+  <w:num w:numId="1004">
+    <w:abstractNumId w:val="99411"/>
+    <w:lvlOverride w:ilvl="0">
+      <w:startOverride w:val="1"/>
+    </w:lvlOverride>
+    <w:lvlOverride w:ilvl="1">
+      <w:startOverride w:val="1"/>
+    </w:lvlOverride>
+    <w:lvlOverride w:ilvl="2">
+      <w:startOverride w:val="1"/>
+    </w:lvlOverride>
+    <w:lvlOverride w:ilvl="3">
+      <w:startOverride w:val="1"/>
+    </w:lvlOverride>
+    <w:lvlOverride w:ilvl="4">
+      <w:startOverride w:val="1"/>
+    </w:lvlOverride>
+    <w:lvlOverride w:ilvl="5">
+      <w:startOverride w:val="1"/>
+    </w:lvlOverride>
+    <w:lvlOverride w:ilvl="6">
+      <w:startOverride w:val="1"/>
+    </w:lvlOverride>
+    <w:lvlOverride w:ilvl="7">
+      <w:startOverride w:val="1"/>
+    </w:lvlOverride>
+    <w:lvlOverride w:ilvl="8">
+      <w:startOverride w:val="1"/>
+    </w:lvlOverride>
+  </w:num>
+  <w:num w:numId="1005">
+    <w:abstractNumId w:val="991"/>
+  </w:num>
+  <w:num w:numId="1006">
+    <w:abstractNumId w:val="99411"/>
+    <w:lvlOverride w:ilvl="0">
+      <w:startOverride w:val="1"/>
+    </w:lvlOverride>
+    <w:lvlOverride w:ilvl="1">
+      <w:startOverride w:val="1"/>
+    </w:lvlOverride>
+    <w:lvlOverride w:ilvl="2">
+      <w:startOverride w:val="1"/>
+    </w:lvlOverride>
+    <w:lvlOverride w:ilvl="3">
+      <w:startOverride w:val="1"/>
+    </w:lvlOverride>
+    <w:lvlOverride w:ilvl="4">
+      <w:startOverride w:val="1"/>
+    </w:lvlOverride>
+    <w:lvlOverride w:ilvl="5">
+      <w:startOverride w:val="1"/>
+    </w:lvlOverride>
+    <w:lvlOverride w:ilvl="6">
+      <w:startOverride w:val="1"/>
+    </w:lvlOverride>
+    <w:lvlOverride w:ilvl="7">
+      <w:startOverride w:val="1"/>
+    </w:lvlOverride>
+    <w:lvlOverride w:ilvl="8">
+      <w:startOverride w:val="1"/>
+    </w:lvlOverride>
+  </w:num>
+  <w:num w:numId="1007">
+    <w:abstractNumId w:val="99411"/>
+    <w:lvlOverride w:ilvl="0">
+      <w:startOverride w:val="1"/>
+    </w:lvlOverride>
+    <w:lvlOverride w:ilvl="1">
+      <w:startOverride w:val="1"/>
+    </w:lvlOverride>
+    <w:lvlOverride w:ilvl="2">
+      <w:startOverride w:val="1"/>
+    </w:lvlOverride>
+    <w:lvlOverride w:ilvl="3">
+      <w:startOverride w:val="1"/>
+    </w:lvlOverride>
+    <w:lvlOverride w:ilvl="4">
+      <w:startOverride w:val="1"/>
+    </w:lvlOverride>
+    <w:lvlOverride w:ilvl="5">
+      <w:startOverride w:val="1"/>
+    </w:lvlOverride>
+    <w:lvlOverride w:ilvl="6">
+      <w:startOverride w:val="1"/>
+    </w:lvlOverride>
+    <w:lvlOverride w:ilvl="7">
+      <w:startOverride w:val="1"/>
+    </w:lvlOverride>
+    <w:lvlOverride w:ilvl="8">
+      <w:startOverride w:val="1"/>
+    </w:lvlOverride>
+  </w:num>
+  <w:num w:numId="1008">
+    <w:abstractNumId w:val="991"/>
+  </w:num>
+  <w:num w:numId="1009">
+    <w:abstractNumId w:val="99411"/>
+    <w:lvlOverride w:ilvl="0">
+      <w:startOverride w:val="1"/>
+    </w:lvlOverride>
+    <w:lvlOverride w:ilvl="1">
+      <w:startOverride w:val="1"/>
+    </w:lvlOverride>
+    <w:lvlOverride w:ilvl="2">
+      <w:startOverride w:val="1"/>
+    </w:lvlOverride>
+    <w:lvlOverride w:ilvl="3">
+      <w:startOverride w:val="1"/>
+    </w:lvlOverride>
+    <w:lvlOverride w:ilvl="4">
+      <w:startOverride w:val="1"/>
+    </w:lvlOverride>
+    <w:lvlOverride w:ilvl="5">
+      <w:startOverride w:val="1"/>
+    </w:lvlOverride>
+    <w:lvlOverride w:ilvl="6">
+      <w:startOverride w:val="1"/>
+    </w:lvlOverride>
+    <w:lvlOverride w:ilvl="7">
+      <w:startOverride w:val="1"/>
+    </w:lvlOverride>
+    <w:lvlOverride w:ilvl="8">
+      <w:startOverride w:val="1"/>
+    </w:lvlOverride>
+  </w:num>
+  <w:num w:numId="1010">
     <w:abstractNumId w:val="991"/>
   </w:num>
 </w:numbering>

</xml_diff>